<commit_message>
feat(portal): tablero Predicciones, Informe de Empalme, PDF dinámico y correcciones de junio
Incorpora el trabajo de junio 2026: nuevo tablero de Predicciones de embalses
(IDEAM, fenómeno de El Niño, umbral 80% y pico proyectado), tablero Colombia
Solar con filtro por programa, botón flotante Informe de Empalme, descarga PDF
dinámica por tablero, noticias de hidrocarburos, tooltips explicativos en
Gestión del Sector y Generación Térmica, y descarga de actas/informes ENAM en
Contratos OR.

Corrige en Supervisión FNCER el cálculo de avance financiero (83,58%→70,04%)
y agrega el gauge de avance general; corrige en curvas S de Contratos OR/FENOGE
el manejo de ceros en blanco, el retroceso de la línea programada y el tope de
100%, y agrega sumatoria de usuarios/potencia en cifras absolutas.

Incluye el informe mensual de junio y sus evidencias, y ajustes de redacción
en el informe de mayo (corrección de fecha de período y simplificación de
lenguaje técnico en entregables).
</commit_message>
<xml_diff>
--- a/informes del mes/INFORME MENSUAL DE ACTIVIDADES - Mayo 2026.docx
+++ b/informes del mes/INFORME MENSUAL DE ACTIVIDADES - Mayo 2026.docx
@@ -23,7 +23,7 @@
     </w:p>
     <w:tbl>
       <w:tblPr>
-        <w:tblW w:w="10774" w:type="dxa"/>
+        <w:tblW w:w="10916" w:type="dxa"/>
         <w:tblInd w:w="-856" w:type="dxa"/>
         <w:tblBorders>
           <w:top w:val="single" w:sz="4" w:space="0" w:color="000000" w:themeColor="text1"/>
@@ -43,10 +43,10 @@
         <w:gridCol w:w="255"/>
         <w:gridCol w:w="273"/>
         <w:gridCol w:w="960"/>
-        <w:gridCol w:w="1545"/>
+        <w:gridCol w:w="1264"/>
+        <w:gridCol w:w="281"/>
         <w:gridCol w:w="235"/>
-        <w:gridCol w:w="192"/>
-        <w:gridCol w:w="513"/>
+        <w:gridCol w:w="705"/>
         <w:gridCol w:w="470"/>
         <w:gridCol w:w="660"/>
         <w:gridCol w:w="750"/>
@@ -54,7 +54,7 @@
         <w:gridCol w:w="235"/>
         <w:gridCol w:w="540"/>
         <w:gridCol w:w="585"/>
-        <w:gridCol w:w="716"/>
+        <w:gridCol w:w="858"/>
       </w:tblGrid>
       <w:tr>
         <w:trPr>
@@ -123,6 +123,7 @@
         <w:tc>
           <w:tcPr>
             <w:tcW w:w="1545" w:type="dxa"/>
+            <w:gridSpan w:val="2"/>
             <w:shd w:val="clear" w:color="auto" w:fill="DBDBDB"/>
             <w:vAlign w:val="center"/>
           </w:tcPr>
@@ -152,7 +153,7 @@
         <w:tc>
           <w:tcPr>
             <w:tcW w:w="2070" w:type="dxa"/>
-            <w:gridSpan w:val="5"/>
+            <w:gridSpan w:val="4"/>
             <w:shd w:val="clear" w:color="auto" w:fill="DBDBDB"/>
             <w:vAlign w:val="center"/>
           </w:tcPr>
@@ -271,7 +272,7 @@
         </w:tc>
         <w:tc>
           <w:tcPr>
-            <w:tcW w:w="716" w:type="dxa"/>
+            <w:tcW w:w="858" w:type="dxa"/>
             <w:shd w:val="clear" w:color="auto" w:fill="D9D9D9" w:themeFill="background1" w:themeFillShade="D9"/>
             <w:vAlign w:val="center"/>
           </w:tcPr>
@@ -430,6 +431,7 @@
         <w:tc>
           <w:tcPr>
             <w:tcW w:w="1545" w:type="dxa"/>
+            <w:gridSpan w:val="2"/>
             <w:shd w:val="clear" w:color="auto" w:fill="FFFFFF" w:themeFill="background1"/>
             <w:vAlign w:val="center"/>
           </w:tcPr>
@@ -478,7 +480,7 @@
         <w:tc>
           <w:tcPr>
             <w:tcW w:w="2070" w:type="dxa"/>
-            <w:gridSpan w:val="5"/>
+            <w:gridSpan w:val="4"/>
             <w:shd w:val="clear" w:color="auto" w:fill="FFFFFF" w:themeFill="background1"/>
             <w:vAlign w:val="center"/>
           </w:tcPr>
@@ -500,7 +502,27 @@
                 <w:sz w:val="20"/>
                 <w:szCs w:val="20"/>
               </w:rPr>
-              <w:t> 30/0</w:t>
+              <w:t> 3</w:t>
+            </w:r>
+            <w:r>
+              <w:rPr>
+                <w:rFonts w:ascii="Arial" w:eastAsia="Arial" w:hAnsi="Arial" w:cs="Arial"/>
+                <w:b/>
+                <w:bCs/>
+                <w:sz w:val="20"/>
+                <w:szCs w:val="20"/>
+              </w:rPr>
+              <w:t>1</w:t>
+            </w:r>
+            <w:r>
+              <w:rPr>
+                <w:rFonts w:ascii="Arial" w:eastAsia="Arial" w:hAnsi="Arial" w:cs="Arial"/>
+                <w:b/>
+                <w:bCs/>
+                <w:sz w:val="20"/>
+                <w:szCs w:val="20"/>
+              </w:rPr>
+              <w:t>/0</w:t>
             </w:r>
             <w:r>
               <w:rPr>
@@ -643,7 +665,7 @@
         </w:tc>
         <w:tc>
           <w:tcPr>
-            <w:tcW w:w="716" w:type="dxa"/>
+            <w:tcW w:w="858" w:type="dxa"/>
             <w:shd w:val="clear" w:color="auto" w:fill="FFFFFF" w:themeFill="background1"/>
             <w:vAlign w:val="center"/>
           </w:tcPr>
@@ -687,7 +709,7 @@
         </w:trPr>
         <w:tc>
           <w:tcPr>
-            <w:tcW w:w="10774" w:type="dxa"/>
+            <w:tcW w:w="10916" w:type="dxa"/>
             <w:gridSpan w:val="18"/>
             <w:shd w:val="clear" w:color="auto" w:fill="ACB9CA"/>
             <w:vAlign w:val="center"/>
@@ -781,7 +803,7 @@
         <w:tc>
           <w:tcPr>
             <w:tcW w:w="3268" w:type="dxa"/>
-            <w:gridSpan w:val="5"/>
+            <w:gridSpan w:val="6"/>
             <w:vMerge w:val="restart"/>
             <w:shd w:val="clear" w:color="auto" w:fill="FFFFFF" w:themeFill="background1"/>
             <w:vAlign w:val="center"/>
@@ -819,7 +841,7 @@
         <w:tc>
           <w:tcPr>
             <w:tcW w:w="2585" w:type="dxa"/>
-            <w:gridSpan w:val="5"/>
+            <w:gridSpan w:val="4"/>
             <w:shd w:val="clear" w:color="auto" w:fill="D9D9D9" w:themeFill="background1" w:themeFillShade="D9"/>
             <w:vAlign w:val="center"/>
           </w:tcPr>
@@ -849,20 +871,8 @@
                 <w:sz w:val="20"/>
                 <w:szCs w:val="20"/>
               </w:rPr>
-              <w:t xml:space="preserve">No. Identificación C.C o </w:t>
-            </w:r>
-            <w:proofErr w:type="gramStart"/>
-            <w:r>
-              <w:rPr>
-                <w:rFonts w:ascii="Arial" w:eastAsia="Arial" w:hAnsi="Arial" w:cs="Arial"/>
-                <w:b/>
-                <w:bCs/>
-                <w:sz w:val="20"/>
-                <w:szCs w:val="20"/>
-              </w:rPr>
-              <w:t>C.E</w:t>
-            </w:r>
-            <w:proofErr w:type="gramEnd"/>
+              <w:t>No. Identificación C.C o C.E</w:t>
+            </w:r>
           </w:p>
         </w:tc>
         <w:tc>
@@ -903,7 +913,7 @@
         </w:tc>
         <w:tc>
           <w:tcPr>
-            <w:tcW w:w="1841" w:type="dxa"/>
+            <w:tcW w:w="1983" w:type="dxa"/>
             <w:gridSpan w:val="3"/>
             <w:shd w:val="clear" w:color="auto" w:fill="D9D9D9" w:themeFill="background1" w:themeFillShade="D9"/>
             <w:vAlign w:val="center"/>
@@ -973,7 +983,7 @@
         <w:tc>
           <w:tcPr>
             <w:tcW w:w="3268" w:type="dxa"/>
-            <w:gridSpan w:val="5"/>
+            <w:gridSpan w:val="6"/>
             <w:vMerge/>
             <w:vAlign w:val="center"/>
           </w:tcPr>
@@ -1000,7 +1010,7 @@
         <w:tc>
           <w:tcPr>
             <w:tcW w:w="2585" w:type="dxa"/>
-            <w:gridSpan w:val="5"/>
+            <w:gridSpan w:val="4"/>
             <w:shd w:val="clear" w:color="auto" w:fill="D9D9D9" w:themeFill="background1" w:themeFillShade="D9"/>
             <w:vAlign w:val="center"/>
           </w:tcPr>
@@ -1072,7 +1082,7 @@
         </w:tc>
         <w:tc>
           <w:tcPr>
-            <w:tcW w:w="1841" w:type="dxa"/>
+            <w:tcW w:w="1983" w:type="dxa"/>
             <w:gridSpan w:val="3"/>
             <w:vAlign w:val="center"/>
           </w:tcPr>
@@ -1154,7 +1164,7 @@
         </w:tc>
         <w:tc>
           <w:tcPr>
-            <w:tcW w:w="9414" w:type="dxa"/>
+            <w:tcW w:w="9556" w:type="dxa"/>
             <w:gridSpan w:val="15"/>
             <w:vMerge w:val="restart"/>
             <w:shd w:val="clear" w:color="auto" w:fill="FFFFFF" w:themeFill="background1"/>
@@ -1218,7 +1228,7 @@
         </w:tc>
         <w:tc>
           <w:tcPr>
-            <w:tcW w:w="9414" w:type="dxa"/>
+            <w:tcW w:w="9556" w:type="dxa"/>
             <w:gridSpan w:val="15"/>
             <w:vMerge/>
             <w:vAlign w:val="center"/>
@@ -1279,7 +1289,7 @@
         </w:tc>
         <w:tc>
           <w:tcPr>
-            <w:tcW w:w="9414" w:type="dxa"/>
+            <w:tcW w:w="9556" w:type="dxa"/>
             <w:gridSpan w:val="15"/>
             <w:vMerge/>
             <w:vAlign w:val="center"/>
@@ -1312,7 +1322,7 @@
         </w:trPr>
         <w:tc>
           <w:tcPr>
-            <w:tcW w:w="10774" w:type="dxa"/>
+            <w:tcW w:w="10916" w:type="dxa"/>
             <w:gridSpan w:val="18"/>
             <w:shd w:val="clear" w:color="auto" w:fill="ACB9CA"/>
             <w:vAlign w:val="center"/>
@@ -1347,8 +1357,8 @@
         </w:trPr>
         <w:tc>
           <w:tcPr>
-            <w:tcW w:w="4820" w:type="dxa"/>
-            <w:gridSpan w:val="9"/>
+            <w:tcW w:w="4112" w:type="dxa"/>
+            <w:gridSpan w:val="7"/>
             <w:shd w:val="clear" w:color="auto" w:fill="D9D9D9" w:themeFill="background1" w:themeFillShade="D9"/>
             <w:vAlign w:val="center"/>
           </w:tcPr>
@@ -1388,8 +1398,8 @@
         </w:tc>
         <w:tc>
           <w:tcPr>
-            <w:tcW w:w="5954" w:type="dxa"/>
-            <w:gridSpan w:val="9"/>
+            <w:tcW w:w="6804" w:type="dxa"/>
+            <w:gridSpan w:val="11"/>
             <w:shd w:val="clear" w:color="auto" w:fill="D9D9D9" w:themeFill="background1" w:themeFillShade="D9"/>
             <w:vAlign w:val="center"/>
           </w:tcPr>
@@ -1449,8 +1459,8 @@
         </w:tc>
         <w:tc>
           <w:tcPr>
-            <w:tcW w:w="4253" w:type="dxa"/>
-            <w:gridSpan w:val="8"/>
+            <w:tcW w:w="3545" w:type="dxa"/>
+            <w:gridSpan w:val="6"/>
             <w:vMerge w:val="restart"/>
             <w:vAlign w:val="center"/>
           </w:tcPr>
@@ -1477,30 +1487,114 @@
         </w:tc>
         <w:tc>
           <w:tcPr>
-            <w:tcW w:w="5954" w:type="dxa"/>
-            <w:gridSpan w:val="9"/>
+            <w:tcW w:w="6804" w:type="dxa"/>
+            <w:gridSpan w:val="11"/>
             <w:vMerge w:val="restart"/>
             <w:vAlign w:val="center"/>
           </w:tcPr>
           <w:p>
-            <w:r>
+            <w:pPr>
+              <w:jc w:val="both"/>
+              <w:rPr>
+                <w:rFonts w:ascii="Arial" w:eastAsia="Arial" w:hAnsi="Arial" w:cs="Arial"/>
+                <w:sz w:val="20"/>
+                <w:szCs w:val="20"/>
+                <w:highlight w:val="white"/>
+              </w:rPr>
+            </w:pPr>
+            <w:r>
+              <w:rPr>
+                <w:rFonts w:ascii="Arial" w:eastAsia="Arial" w:hAnsi="Arial" w:cs="Arial"/>
+                <w:sz w:val="20"/>
+                <w:szCs w:val="20"/>
+                <w:highlight w:val="white"/>
+              </w:rPr>
               <w:t>Se apoyó a la supervisión en la revisión metodológica, parametrización y filtrado de beneficiarios del departamento de Sucre, obteniendo los datos finales con el informe técnico correspondiente.</w:t>
             </w:r>
           </w:p>
           <w:p>
-            <w:r/>
-          </w:p>
-          <w:p>
-            <w:r>
-              <w:t>La prioridad del mes, definida por la supervisión, fue la estabilización y completitud del Portal de Dirección como plataforma central de seguimiento de los grupos de la Dirección de Energía Eléctrica. En ese marco, se atendieron los ajustes al módulo de Comunidades Energéticas registrados en el documento Observaciones_Tablero_DEE.docx: se eliminó la gráfica de curva S de operadores de red que no cumplía la metodología solicitada y se incorporaron cuatro nuevas gráficas de curva S a partir de las hojas verdes y azules del archivo Cuadro Inauguraciones_Colombia Solar Completo_CE_OR.xlsx. Se reordenó la tabla de Colombia Solar por meses y se habilitó la exportación a Excel del detalle por departamento y municipio.</w:t>
-            </w:r>
-          </w:p>
-          <w:p>
-            <w:r/>
-          </w:p>
-          <w:p>
-            <w:r>
-              <w:t>Evidencia: informe técnico Sucre, capturas del tablero Comunidades Energéticas, enlace SharePoint del archivo fuente, carpeta evidencias mayo / SECOP II.</w:t>
+            <w:pPr>
+              <w:jc w:val="both"/>
+              <w:rPr>
+                <w:rFonts w:ascii="Arial" w:eastAsia="Arial" w:hAnsi="Arial" w:cs="Arial"/>
+                <w:sz w:val="20"/>
+                <w:szCs w:val="20"/>
+                <w:highlight w:val="white"/>
+              </w:rPr>
+            </w:pPr>
+          </w:p>
+          <w:p>
+            <w:pPr>
+              <w:jc w:val="both"/>
+              <w:rPr>
+                <w:rFonts w:ascii="Arial" w:eastAsia="Arial" w:hAnsi="Arial" w:cs="Arial"/>
+                <w:sz w:val="20"/>
+                <w:szCs w:val="20"/>
+                <w:highlight w:val="white"/>
+              </w:rPr>
+            </w:pPr>
+            <w:r>
+              <w:rPr>
+                <w:rFonts w:ascii="Arial" w:eastAsia="Arial" w:hAnsi="Arial" w:cs="Arial"/>
+                <w:sz w:val="20"/>
+                <w:szCs w:val="20"/>
+                <w:highlight w:val="white"/>
+              </w:rPr>
+              <w:t xml:space="preserve">La prioridad del mes, definida por la supervisión, fue la estabilización y completitud del Portal de Dirección como plataforma central de seguimiento de los grupos de la Dirección de Energía Eléctrica. En ese marco, </w:t>
+            </w:r>
+            <w:r>
+              <w:rPr>
+                <w:rFonts w:ascii="Arial" w:eastAsia="Arial" w:hAnsi="Arial" w:cs="Arial"/>
+                <w:sz w:val="20"/>
+                <w:szCs w:val="20"/>
+                <w:highlight w:val="white"/>
+              </w:rPr>
+              <w:t xml:space="preserve">se realizaron los ajustes solicitados por el equipo de </w:t>
+            </w:r>
+            <w:r>
+              <w:rPr>
+                <w:rFonts w:ascii="Arial" w:eastAsia="Arial" w:hAnsi="Arial" w:cs="Arial"/>
+                <w:sz w:val="20"/>
+                <w:szCs w:val="20"/>
+                <w:highlight w:val="white"/>
+              </w:rPr>
+              <w:t>Colombia Solar</w:t>
+            </w:r>
+            <w:r>
+              <w:rPr>
+                <w:rFonts w:ascii="Arial" w:eastAsia="Arial" w:hAnsi="Arial" w:cs="Arial"/>
+                <w:sz w:val="20"/>
+                <w:szCs w:val="20"/>
+                <w:highlight w:val="white"/>
+              </w:rPr>
+              <w:t xml:space="preserve">, </w:t>
+            </w:r>
+            <w:r>
+              <w:rPr>
+                <w:rFonts w:ascii="Arial" w:eastAsia="Arial" w:hAnsi="Arial" w:cs="Arial"/>
+                <w:sz w:val="20"/>
+                <w:szCs w:val="20"/>
+                <w:highlight w:val="white"/>
+              </w:rPr>
+              <w:t>se eliminó la gráfica de curva S de operadores de red que no cumplía la metodología solicitada y se incorporaron cuatro nuevas gráficas de curva S a partir de</w:t>
+            </w:r>
+            <w:r>
+              <w:rPr>
+                <w:rFonts w:ascii="Arial" w:eastAsia="Arial" w:hAnsi="Arial" w:cs="Arial"/>
+                <w:sz w:val="20"/>
+                <w:szCs w:val="20"/>
+                <w:highlight w:val="white"/>
+              </w:rPr>
+              <w:t xml:space="preserve"> nuevos datos compartidos por el equipo</w:t>
+            </w:r>
+            <w:r>
+              <w:rPr>
+                <w:rFonts w:ascii="Arial" w:eastAsia="Arial" w:hAnsi="Arial" w:cs="Arial"/>
+                <w:sz w:val="20"/>
+                <w:szCs w:val="20"/>
+                <w:highlight w:val="white"/>
+              </w:rPr>
+              <w:t>. Se reordenó la tabla de Colombia Solar por meses y se habilitó la exportación a Excel del detalle por departamento y municipio.</w:t>
             </w:r>
           </w:p>
         </w:tc>
@@ -1538,8 +1632,8 @@
         </w:tc>
         <w:tc>
           <w:tcPr>
-            <w:tcW w:w="4253" w:type="dxa"/>
-            <w:gridSpan w:val="8"/>
+            <w:tcW w:w="3545" w:type="dxa"/>
+            <w:gridSpan w:val="6"/>
             <w:vMerge/>
             <w:vAlign w:val="center"/>
           </w:tcPr>
@@ -1566,8 +1660,8 @@
         </w:tc>
         <w:tc>
           <w:tcPr>
-            <w:tcW w:w="5954" w:type="dxa"/>
-            <w:gridSpan w:val="9"/>
+            <w:tcW w:w="6804" w:type="dxa"/>
+            <w:gridSpan w:val="11"/>
             <w:vMerge/>
             <w:vAlign w:val="center"/>
           </w:tcPr>
@@ -1624,8 +1718,8 @@
         </w:tc>
         <w:tc>
           <w:tcPr>
-            <w:tcW w:w="4253" w:type="dxa"/>
-            <w:gridSpan w:val="8"/>
+            <w:tcW w:w="3545" w:type="dxa"/>
+            <w:gridSpan w:val="6"/>
             <w:vMerge/>
             <w:vAlign w:val="center"/>
           </w:tcPr>
@@ -1652,8 +1746,8 @@
         </w:tc>
         <w:tc>
           <w:tcPr>
-            <w:tcW w:w="5954" w:type="dxa"/>
-            <w:gridSpan w:val="9"/>
+            <w:tcW w:w="6804" w:type="dxa"/>
+            <w:gridSpan w:val="11"/>
             <w:vMerge/>
             <w:vAlign w:val="center"/>
           </w:tcPr>
@@ -1703,15 +1797,14 @@
                 <w:sz w:val="20"/>
                 <w:szCs w:val="20"/>
               </w:rPr>
-              <w:lastRenderedPageBreak/>
               <w:t>2</w:t>
             </w:r>
           </w:p>
         </w:tc>
         <w:tc>
           <w:tcPr>
-            <w:tcW w:w="4253" w:type="dxa"/>
-            <w:gridSpan w:val="8"/>
+            <w:tcW w:w="3545" w:type="dxa"/>
+            <w:gridSpan w:val="6"/>
             <w:vMerge w:val="restart"/>
             <w:vAlign w:val="center"/>
           </w:tcPr>
@@ -1738,47 +1831,396 @@
         </w:tc>
         <w:tc>
           <w:tcPr>
-            <w:tcW w:w="5954" w:type="dxa"/>
-            <w:gridSpan w:val="9"/>
+            <w:tcW w:w="6804" w:type="dxa"/>
+            <w:gridSpan w:val="11"/>
             <w:vMerge w:val="restart"/>
             <w:vAlign w:val="center"/>
           </w:tcPr>
           <w:p>
-            <w:r>
+            <w:pPr>
+              <w:jc w:val="both"/>
+              <w:rPr>
+                <w:rFonts w:ascii="Arial" w:eastAsia="Arial" w:hAnsi="Arial" w:cs="Arial"/>
+                <w:sz w:val="20"/>
+                <w:szCs w:val="20"/>
+              </w:rPr>
+            </w:pPr>
+            <w:r>
+              <w:rPr>
+                <w:rFonts w:ascii="Arial" w:eastAsia="Arial" w:hAnsi="Arial" w:cs="Arial"/>
+                <w:sz w:val="20"/>
+                <w:szCs w:val="20"/>
+              </w:rPr>
               <w:t>Se consolidó el Portal de Dirección (https://portalviceministerioenergia.minenergia.gov.co/) como producto analítico unificado de la Dirección de Energía Eléctrica, en respuesta a la directriz del Viceministro de centralizar en esta plataforma los avances que antes presentaba cada grupo en Power BI. Por solicitud del Viceministro, el dominio público migró de portaldireccionee.minenergia.gov.co al nuevo enlace durante el mes.</w:t>
             </w:r>
           </w:p>
           <w:p>
-            <w:r/>
-          </w:p>
-          <w:p>
-            <w:r>
-              <w:t>En la primera fase (1 al 17 de mayo) se implementaron las correcciones comunicadas por la supervisión a través del documento Observaciones_Tablero_DEE.docx, consolidadas a partir de las reuniones que Diana Gutiérrez y Daniel Villarreal sostuvieron con cada equipo. En Gestión del Sector se actualizaron los valores del slide, se incorporaron las gráficas de generación y precio de bolsa en la vista móvil y se añadieron flechas de tendencia en los KPIs. En Apropiación Presupuestal se corrigieron los valores con datos reales, se ajustó la gráfica apilada y se añadió la etiqueta de corte al 1 de abril. En Comunidades Energéticas se configuraron los filtros de inicio, se corrigió el valor de inversión y se renombró avance de obra a avance general en Contratos OR. En Supervisión FNCER se implementó la visualización por número de contratos y se incorporaron sus indicadores en la pantalla inicial. En Subsidios se restringió la vista a resoluciones 2026, se presentó el total de deuda con corte al 1 de abril, se habilitó la fórmula Total apropiado menos Total asignado igual a Total disponible, y se desarrollaron tres tableros nuevos: déficit histórico, detalle de pagos y validaciones. Para FENOGE se implementaron los tableros 1.0 y 1.1 y se separaron las rutas de Comunidades y Subsidios. En paralelo (2-10 de mayo) se refactorizó la arquitectura del HomeSlider con extracción de slides a módulos independientes, capa apiService.ts, librerías format.ts, kpi-logic.ts y svg-math.ts, y una suite de 49 pruebas Vitest.</w:t>
-            </w:r>
-          </w:p>
-          <w:p>
-            <w:r/>
-          </w:p>
-          <w:p>
-            <w:r>
-              <w:t>En la segunda fase (25-30 de mayo) se atendieron los ítems del documento Observaciones_Tablero_DEE.docx y solicitudes adicionales de supervisión. En Subsidios se actualizó el tablero de déficit histórico con la necesidad presupuestal de la vigencia (Subsidios menos Contribuciones), la apropiación PGN, los recursos faltantes y gráficas comparativas. En Contratos OR se incorporó el filtro por operador en las curvas S. En Gestión del Sector se añadió la gráfica de embalses, el slide de generación térmica con datos de PostgreSQL y el botón de descarga de informes PDF de XM. Se actualizaron los cortes (presupuesto al 1 de mayo, subsidios al 15 de mayo), se unificó la terminología a Valor Comprometido en Resoluciones y se extendieron las curvas S de FENOGE hasta junio y julio de 2026. La incidencia de servidor ocurrida entre el 19 y el 25 de mayo interrumpió los despliegues; la gestión de esa incidencia consta en la Obligación 8.</w:t>
-            </w:r>
-          </w:p>
-          <w:p>
-            <w:r/>
-          </w:p>
-          <w:p>
-            <w:r>
+            <w:pPr>
+              <w:jc w:val="both"/>
+              <w:rPr>
+                <w:rFonts w:ascii="Arial" w:eastAsia="Arial" w:hAnsi="Arial" w:cs="Arial"/>
+                <w:sz w:val="20"/>
+                <w:szCs w:val="20"/>
+              </w:rPr>
+            </w:pPr>
+          </w:p>
+          <w:p>
+            <w:pPr>
+              <w:jc w:val="both"/>
+              <w:rPr>
+                <w:rFonts w:ascii="Arial" w:eastAsia="Arial" w:hAnsi="Arial" w:cs="Arial"/>
+                <w:sz w:val="20"/>
+                <w:szCs w:val="20"/>
+              </w:rPr>
+            </w:pPr>
+            <w:r>
+              <w:rPr>
+                <w:rFonts w:ascii="Arial" w:eastAsia="Arial" w:hAnsi="Arial" w:cs="Arial"/>
+                <w:sz w:val="20"/>
+                <w:szCs w:val="20"/>
+              </w:rPr>
+              <w:t xml:space="preserve">En la primera fase (1 al 17 de mayo) se implementaron las correcciones comunicadas por la supervisión a través del documento Observaciones_Tablero_DEE.docx, consolidadas a partir de las reuniones que Diana Gutiérrez y Daniel Villarreal sostuvieron con cada equipo. </w:t>
+            </w:r>
+          </w:p>
+          <w:p>
+            <w:pPr>
+              <w:jc w:val="both"/>
+              <w:rPr>
+                <w:rFonts w:ascii="Arial" w:eastAsia="Arial" w:hAnsi="Arial" w:cs="Arial"/>
+                <w:sz w:val="20"/>
+                <w:szCs w:val="20"/>
+              </w:rPr>
+            </w:pPr>
+          </w:p>
+          <w:p>
+            <w:pPr>
+              <w:jc w:val="both"/>
+              <w:rPr>
+                <w:rFonts w:ascii="Arial" w:eastAsia="Arial" w:hAnsi="Arial" w:cs="Arial"/>
+                <w:sz w:val="20"/>
+                <w:szCs w:val="20"/>
+              </w:rPr>
+            </w:pPr>
+            <w:r>
+              <w:rPr>
+                <w:rFonts w:ascii="Arial" w:eastAsia="Arial" w:hAnsi="Arial" w:cs="Arial"/>
+                <w:sz w:val="20"/>
+                <w:szCs w:val="20"/>
+              </w:rPr>
+              <w:t xml:space="preserve">En Gestión del Sector se actualizaron los valores del slide, se incorporaron las gráficas de generación y precio de bolsa en la vista móvil y se añadieron flechas de tendencia en los KPIs. </w:t>
+            </w:r>
+          </w:p>
+          <w:p>
+            <w:pPr>
+              <w:jc w:val="both"/>
+              <w:rPr>
+                <w:rFonts w:ascii="Arial" w:eastAsia="Arial" w:hAnsi="Arial" w:cs="Arial"/>
+                <w:sz w:val="20"/>
+                <w:szCs w:val="20"/>
+              </w:rPr>
+            </w:pPr>
+            <w:r>
+              <w:rPr>
+                <w:rFonts w:ascii="Arial" w:eastAsia="Arial" w:hAnsi="Arial" w:cs="Arial"/>
+                <w:sz w:val="20"/>
+                <w:szCs w:val="20"/>
+              </w:rPr>
+              <w:t xml:space="preserve">En Apropiación Presupuestal se corrigieron los valores con datos reales, se ajustó la gráfica apilada y se añadió la etiqueta de corte al 1 de abril. </w:t>
+            </w:r>
+          </w:p>
+          <w:p>
+            <w:pPr>
+              <w:jc w:val="both"/>
+              <w:rPr>
+                <w:rFonts w:ascii="Arial" w:eastAsia="Arial" w:hAnsi="Arial" w:cs="Arial"/>
+                <w:sz w:val="20"/>
+                <w:szCs w:val="20"/>
+              </w:rPr>
+            </w:pPr>
+            <w:r>
+              <w:rPr>
+                <w:rFonts w:ascii="Arial" w:eastAsia="Arial" w:hAnsi="Arial" w:cs="Arial"/>
+                <w:sz w:val="20"/>
+                <w:szCs w:val="20"/>
+              </w:rPr>
+              <w:t xml:space="preserve">En Comunidades Energéticas se configuraron los filtros de inicio, se corrigió el valor de inversión y se renombró avance de obra a avance general en Contratos OR. </w:t>
+            </w:r>
+          </w:p>
+          <w:p>
+            <w:pPr>
+              <w:jc w:val="both"/>
+              <w:rPr>
+                <w:rFonts w:ascii="Arial" w:eastAsia="Arial" w:hAnsi="Arial" w:cs="Arial"/>
+                <w:sz w:val="20"/>
+                <w:szCs w:val="20"/>
+              </w:rPr>
+            </w:pPr>
+            <w:r>
+              <w:rPr>
+                <w:rFonts w:ascii="Arial" w:eastAsia="Arial" w:hAnsi="Arial" w:cs="Arial"/>
+                <w:sz w:val="20"/>
+                <w:szCs w:val="20"/>
+              </w:rPr>
+              <w:t xml:space="preserve">En Supervisión FNCER se implementó la visualización por número de contratos y se incorporaron sus indicadores en la pantalla inicial. </w:t>
+            </w:r>
+          </w:p>
+          <w:p>
+            <w:pPr>
+              <w:jc w:val="both"/>
+              <w:rPr>
+                <w:rFonts w:ascii="Arial" w:eastAsia="Arial" w:hAnsi="Arial" w:cs="Arial"/>
+                <w:sz w:val="20"/>
+                <w:szCs w:val="20"/>
+              </w:rPr>
+            </w:pPr>
+            <w:r>
+              <w:rPr>
+                <w:rFonts w:ascii="Arial" w:eastAsia="Arial" w:hAnsi="Arial" w:cs="Arial"/>
+                <w:sz w:val="20"/>
+                <w:szCs w:val="20"/>
+              </w:rPr>
+              <w:t xml:space="preserve">En Subsidios se restringió la vista a resoluciones 2026, se presentó el total de deuda con corte al 1 de abril, se habilitó la fórmula Total apropiado menos Total asignado igual a Total disponible, y se desarrollaron tres tableros nuevos: déficit histórico, detalle de pagos y validaciones. </w:t>
+            </w:r>
+          </w:p>
+          <w:p>
+            <w:pPr>
+              <w:jc w:val="both"/>
+              <w:rPr>
+                <w:rFonts w:ascii="Arial" w:eastAsia="Arial" w:hAnsi="Arial" w:cs="Arial"/>
+                <w:sz w:val="20"/>
+                <w:szCs w:val="20"/>
+              </w:rPr>
+            </w:pPr>
+            <w:r>
+              <w:rPr>
+                <w:rFonts w:ascii="Arial" w:eastAsia="Arial" w:hAnsi="Arial" w:cs="Arial"/>
+                <w:sz w:val="20"/>
+                <w:szCs w:val="20"/>
+              </w:rPr>
+              <w:t xml:space="preserve">Para FENOGE se implementaron los tableros 1.0 y 1.1 y se separaron las rutas de Comunidades y Subsidios. </w:t>
+            </w:r>
+          </w:p>
+          <w:p>
+            <w:pPr>
+              <w:jc w:val="both"/>
+              <w:rPr>
+                <w:rFonts w:ascii="Arial" w:eastAsia="Arial" w:hAnsi="Arial" w:cs="Arial"/>
+                <w:sz w:val="20"/>
+                <w:szCs w:val="20"/>
+              </w:rPr>
+            </w:pPr>
+          </w:p>
+          <w:p>
+            <w:pPr>
+              <w:jc w:val="both"/>
+              <w:rPr>
+                <w:rFonts w:ascii="Arial" w:eastAsia="Arial" w:hAnsi="Arial" w:cs="Arial"/>
+                <w:sz w:val="20"/>
+                <w:szCs w:val="20"/>
+              </w:rPr>
+            </w:pPr>
+            <w:r>
+              <w:rPr>
+                <w:rFonts w:ascii="Arial" w:eastAsia="Arial" w:hAnsi="Arial" w:cs="Arial"/>
+                <w:sz w:val="20"/>
+                <w:szCs w:val="20"/>
+              </w:rPr>
+              <w:t>En paralelo (2-10 de mayo) se refactorizó la arquitectura del HomeSlider con extracción de slides a módulos independientes, capa apiService.ts, librerías format.ts, kpi-logic.ts y svg-math.ts, y una suite de 49 pruebas Vitest.</w:t>
+            </w:r>
+          </w:p>
+          <w:p>
+            <w:pPr>
+              <w:jc w:val="both"/>
+              <w:rPr>
+                <w:rFonts w:ascii="Arial" w:eastAsia="Arial" w:hAnsi="Arial" w:cs="Arial"/>
+                <w:sz w:val="20"/>
+                <w:szCs w:val="20"/>
+              </w:rPr>
+            </w:pPr>
+          </w:p>
+          <w:p>
+            <w:pPr>
+              <w:jc w:val="both"/>
+              <w:rPr>
+                <w:rFonts w:ascii="Arial" w:eastAsia="Arial" w:hAnsi="Arial" w:cs="Arial"/>
+                <w:sz w:val="20"/>
+                <w:szCs w:val="20"/>
+              </w:rPr>
+            </w:pPr>
+            <w:r>
+              <w:rPr>
+                <w:rFonts w:ascii="Arial" w:eastAsia="Arial" w:hAnsi="Arial" w:cs="Arial"/>
+                <w:sz w:val="20"/>
+                <w:szCs w:val="20"/>
+              </w:rPr>
+              <w:t xml:space="preserve">En la segunda fase (25-30 de mayo) se atendieron los ítems del documento Observaciones_Tablero_DEE.docx y solicitudes adicionales de supervisión. </w:t>
+            </w:r>
+          </w:p>
+          <w:p>
+            <w:pPr>
+              <w:jc w:val="both"/>
+              <w:rPr>
+                <w:rFonts w:ascii="Arial" w:eastAsia="Arial" w:hAnsi="Arial" w:cs="Arial"/>
+                <w:sz w:val="20"/>
+                <w:szCs w:val="20"/>
+              </w:rPr>
+            </w:pPr>
+            <w:r>
+              <w:rPr>
+                <w:rFonts w:ascii="Arial" w:eastAsia="Arial" w:hAnsi="Arial" w:cs="Arial"/>
+                <w:sz w:val="20"/>
+                <w:szCs w:val="20"/>
+              </w:rPr>
+              <w:t>En Subsidios se actualizó el tablero de déficit histórico con la necesidad presupuestal de la vigencia (Subsidios menos Contribuciones), la apropiación PGN, los recursos faltantes y gráficas comparativas.</w:t>
+            </w:r>
+          </w:p>
+          <w:p>
+            <w:pPr>
+              <w:jc w:val="both"/>
+              <w:rPr>
+                <w:rFonts w:ascii="Arial" w:eastAsia="Arial" w:hAnsi="Arial" w:cs="Arial"/>
+                <w:sz w:val="20"/>
+                <w:szCs w:val="20"/>
+              </w:rPr>
+            </w:pPr>
+            <w:r>
+              <w:rPr>
+                <w:rFonts w:ascii="Arial" w:eastAsia="Arial" w:hAnsi="Arial" w:cs="Arial"/>
+                <w:sz w:val="20"/>
+                <w:szCs w:val="20"/>
+              </w:rPr>
+              <w:t xml:space="preserve">En Contratos OR se incorporó el filtro por operador en las curvas S. </w:t>
+            </w:r>
+          </w:p>
+          <w:p>
+            <w:pPr>
+              <w:jc w:val="both"/>
+              <w:rPr>
+                <w:rFonts w:ascii="Arial" w:eastAsia="Arial" w:hAnsi="Arial" w:cs="Arial"/>
+                <w:sz w:val="20"/>
+                <w:szCs w:val="20"/>
+              </w:rPr>
+            </w:pPr>
+            <w:r>
+              <w:rPr>
+                <w:rFonts w:ascii="Arial" w:eastAsia="Arial" w:hAnsi="Arial" w:cs="Arial"/>
+                <w:sz w:val="20"/>
+                <w:szCs w:val="20"/>
+              </w:rPr>
+              <w:t xml:space="preserve">En Gestión del Sector se añadió la gráfica de embalses, el slide de generación térmica con datos de PostgreSQL y el botón de descarga de informes PDF de XM. </w:t>
+            </w:r>
+          </w:p>
+          <w:p>
+            <w:pPr>
+              <w:jc w:val="both"/>
+              <w:rPr>
+                <w:rFonts w:ascii="Arial" w:eastAsia="Arial" w:hAnsi="Arial" w:cs="Arial"/>
+                <w:sz w:val="20"/>
+                <w:szCs w:val="20"/>
+              </w:rPr>
+            </w:pPr>
+            <w:r>
+              <w:rPr>
+                <w:rFonts w:ascii="Arial" w:eastAsia="Arial" w:hAnsi="Arial" w:cs="Arial"/>
+                <w:sz w:val="20"/>
+                <w:szCs w:val="20"/>
+              </w:rPr>
+              <w:t xml:space="preserve">Se actualizaron los cortes (presupuesto al 1 de mayo, subsidios al 15 de mayo), se unificó la terminología a Valor Comprometido en Resoluciones y se extendieron las curvas S de FENOGE hasta junio y julio de 2026. </w:t>
+            </w:r>
+          </w:p>
+          <w:p>
+            <w:pPr>
+              <w:jc w:val="both"/>
+              <w:rPr>
+                <w:rFonts w:ascii="Arial" w:eastAsia="Arial" w:hAnsi="Arial" w:cs="Arial"/>
+                <w:sz w:val="20"/>
+                <w:szCs w:val="20"/>
+              </w:rPr>
+            </w:pPr>
+          </w:p>
+          <w:p>
+            <w:pPr>
+              <w:jc w:val="both"/>
+              <w:rPr>
+                <w:rFonts w:ascii="Arial" w:eastAsia="Arial" w:hAnsi="Arial" w:cs="Arial"/>
+                <w:sz w:val="20"/>
+                <w:szCs w:val="20"/>
+              </w:rPr>
+            </w:pPr>
+            <w:r>
+              <w:rPr>
+                <w:rFonts w:ascii="Arial" w:eastAsia="Arial" w:hAnsi="Arial" w:cs="Arial"/>
+                <w:sz w:val="20"/>
+                <w:szCs w:val="20"/>
+              </w:rPr>
+              <w:t xml:space="preserve">Se integró toda la información actualmente presente en el portal de dirección en el chat bot del portal y del tangram, unificando toda la información del sistema completo. </w:t>
+            </w:r>
+          </w:p>
+          <w:p>
+            <w:pPr>
+              <w:jc w:val="both"/>
+              <w:rPr>
+                <w:rFonts w:ascii="Arial" w:eastAsia="Arial" w:hAnsi="Arial" w:cs="Arial"/>
+                <w:sz w:val="20"/>
+                <w:szCs w:val="20"/>
+              </w:rPr>
+            </w:pPr>
+          </w:p>
+          <w:p>
+            <w:pPr>
+              <w:jc w:val="both"/>
+              <w:rPr>
+                <w:rFonts w:ascii="Arial" w:eastAsia="Arial" w:hAnsi="Arial" w:cs="Arial"/>
+                <w:sz w:val="20"/>
+                <w:szCs w:val="20"/>
+              </w:rPr>
+            </w:pPr>
+            <w:r>
+              <w:rPr>
+                <w:rFonts w:ascii="Arial" w:eastAsia="Arial" w:hAnsi="Arial" w:cs="Arial"/>
+                <w:sz w:val="20"/>
+                <w:szCs w:val="20"/>
+              </w:rPr>
+              <w:t>La incidencia de servidor ocurrida entre el 19 y el 25 de mayo interrumpió los despliegues; la gestión de esa incidencia consta en la Obligación 8.</w:t>
+            </w:r>
+          </w:p>
+          <w:p>
+            <w:pPr>
+              <w:jc w:val="both"/>
+              <w:rPr>
+                <w:rFonts w:ascii="Arial" w:eastAsia="Arial" w:hAnsi="Arial" w:cs="Arial"/>
+                <w:sz w:val="20"/>
+                <w:szCs w:val="20"/>
+              </w:rPr>
+            </w:pPr>
+          </w:p>
+          <w:p>
+            <w:pPr>
+              <w:jc w:val="both"/>
+              <w:rPr>
+                <w:rFonts w:ascii="Arial" w:eastAsia="Arial" w:hAnsi="Arial" w:cs="Arial"/>
+                <w:sz w:val="20"/>
+                <w:szCs w:val="20"/>
+              </w:rPr>
+            </w:pPr>
+            <w:r>
+              <w:rPr>
+                <w:rFonts w:ascii="Arial" w:eastAsia="Arial" w:hAnsi="Arial" w:cs="Arial"/>
+                <w:sz w:val="20"/>
+                <w:szCs w:val="20"/>
+              </w:rPr>
               <w:t>La actividad de la pestaña de Redes Sociales X no pudo completarse porque la plataforma cobra por el acceso a su API y los embeds respondieron con error HTTP 429; situación comunicada a supervisión el 17 de mayo. Se reportaron como pendientes para junio los tableros de hidrocarburos, ajustes visuales finos e informe estandarizado DEE.</w:t>
             </w:r>
           </w:p>
           <w:p>
-            <w:r/>
-          </w:p>
-          <w:p>
-            <w:r>
-              <w:t>Evidencia: repositorios GitHub Portal-MME-Frontend y Portal-MME-Backend (commits mayo 2026), portal en producción, carpeta evidencias mayo / SECOP II.</w:t>
-            </w:r>
+            <w:pPr>
+              <w:jc w:val="both"/>
+              <w:rPr>
+                <w:rFonts w:ascii="Arial" w:eastAsia="Arial" w:hAnsi="Arial" w:cs="Arial"/>
+                <w:sz w:val="20"/>
+                <w:szCs w:val="20"/>
+              </w:rPr>
+            </w:pPr>
           </w:p>
         </w:tc>
       </w:tr>
@@ -1813,8 +2255,8 @@
         </w:tc>
         <w:tc>
           <w:tcPr>
-            <w:tcW w:w="4253" w:type="dxa"/>
-            <w:gridSpan w:val="8"/>
+            <w:tcW w:w="3545" w:type="dxa"/>
+            <w:gridSpan w:val="6"/>
             <w:vMerge/>
             <w:vAlign w:val="center"/>
           </w:tcPr>
@@ -1839,8 +2281,8 @@
         </w:tc>
         <w:tc>
           <w:tcPr>
-            <w:tcW w:w="5954" w:type="dxa"/>
-            <w:gridSpan w:val="9"/>
+            <w:tcW w:w="6804" w:type="dxa"/>
+            <w:gridSpan w:val="11"/>
             <w:vMerge/>
             <w:vAlign w:val="center"/>
           </w:tcPr>
@@ -1895,8 +2337,8 @@
         </w:tc>
         <w:tc>
           <w:tcPr>
-            <w:tcW w:w="4253" w:type="dxa"/>
-            <w:gridSpan w:val="8"/>
+            <w:tcW w:w="3545" w:type="dxa"/>
+            <w:gridSpan w:val="6"/>
             <w:vMerge/>
             <w:vAlign w:val="center"/>
           </w:tcPr>
@@ -1921,8 +2363,8 @@
         </w:tc>
         <w:tc>
           <w:tcPr>
-            <w:tcW w:w="5954" w:type="dxa"/>
-            <w:gridSpan w:val="9"/>
+            <w:tcW w:w="6804" w:type="dxa"/>
+            <w:gridSpan w:val="11"/>
             <w:vMerge/>
             <w:vAlign w:val="center"/>
           </w:tcPr>
@@ -1972,15 +2414,51 @@
                 <w:sz w:val="20"/>
                 <w:szCs w:val="20"/>
               </w:rPr>
+              <w:t>3</w:t>
+            </w:r>
+          </w:p>
+        </w:tc>
+        <w:tc>
+          <w:tcPr>
+            <w:tcW w:w="3545" w:type="dxa"/>
+            <w:gridSpan w:val="6"/>
+            <w:vMerge w:val="restart"/>
+            <w:vAlign w:val="center"/>
+          </w:tcPr>
+          <w:p>
+            <w:pPr>
+              <w:jc w:val="both"/>
+              <w:rPr>
+                <w:rFonts w:ascii="Arial" w:eastAsia="Arial" w:hAnsi="Arial" w:cs="Arial"/>
+                <w:sz w:val="20"/>
+                <w:szCs w:val="20"/>
+              </w:rPr>
+            </w:pPr>
+            <w:r>
+              <w:rPr>
+                <w:rFonts w:ascii="Arial" w:eastAsia="Arial" w:hAnsi="Arial" w:cs="Arial"/>
+                <w:sz w:val="20"/>
+                <w:szCs w:val="20"/>
+                <w:highlight w:val="white"/>
+              </w:rPr>
+              <w:t xml:space="preserve">Apoyar el almacenamiento, gestión y organización de documentos y </w:t>
+            </w:r>
+            <w:r>
+              <w:rPr>
+                <w:rFonts w:ascii="Arial" w:eastAsia="Arial" w:hAnsi="Arial" w:cs="Arial"/>
+                <w:sz w:val="20"/>
+                <w:szCs w:val="20"/>
+                <w:highlight w:val="white"/>
+              </w:rPr>
               <w:lastRenderedPageBreak/>
-              <w:t>3</w:t>
-            </w:r>
-          </w:p>
-        </w:tc>
-        <w:tc>
-          <w:tcPr>
-            <w:tcW w:w="4253" w:type="dxa"/>
-            <w:gridSpan w:val="8"/>
+              <w:t>archivos generados en el marco de las actividades contractuales, garantizando su adecuada administración en los sistemas de información dispuestos por la entidad.</w:t>
+            </w:r>
+          </w:p>
+        </w:tc>
+        <w:tc>
+          <w:tcPr>
+            <w:tcW w:w="6804" w:type="dxa"/>
+            <w:gridSpan w:val="11"/>
             <w:vMerge w:val="restart"/>
             <w:vAlign w:val="center"/>
           </w:tcPr>
@@ -1998,54 +2476,106 @@
                 <w:rFonts w:ascii="Arial" w:eastAsia="Arial" w:hAnsi="Arial" w:cs="Arial"/>
                 <w:sz w:val="20"/>
                 <w:szCs w:val="20"/>
-                <w:highlight w:val="white"/>
-              </w:rPr>
-              <w:t>Apoyar el almacenamiento, gestión y organización de documentos y archivos generados en el marco de las actividades contractuales, garantizando su adecuada administración en los sistemas de información dispuestos por la entidad.</w:t>
-            </w:r>
-          </w:p>
-        </w:tc>
-        <w:tc>
-          <w:tcPr>
-            <w:tcW w:w="5954" w:type="dxa"/>
-            <w:gridSpan w:val="9"/>
-            <w:vMerge w:val="restart"/>
-            <w:vAlign w:val="center"/>
-          </w:tcPr>
-          <w:p>
-            <w:r>
-              <w:t>Se mantuvo el control de versiones continuo de todos los desarrollos en los repositorios GitHub Portal-MME-Frontend y Portal-MME-Backend, con mensajes descriptivos y trazabilidad por fecha de cada cambio implementado.</w:t>
-            </w:r>
-          </w:p>
-          <w:p>
-            <w:r/>
-          </w:p>
-          <w:p>
-            <w:r>
+              </w:rPr>
+              <w:lastRenderedPageBreak/>
+              <w:t xml:space="preserve">Se mantuvo el control de versiones continuo de todos los desarrollos en los repositorios GitHub Portal-MME-Frontend y Portal-MME-Backend, con </w:t>
+            </w:r>
+            <w:r>
+              <w:rPr>
+                <w:rFonts w:ascii="Arial" w:eastAsia="Arial" w:hAnsi="Arial" w:cs="Arial"/>
+                <w:sz w:val="20"/>
+                <w:szCs w:val="20"/>
+              </w:rPr>
+              <w:lastRenderedPageBreak/>
+              <w:t>mensajes descriptivos y trazabilidad por fecha de cada cambio implementado.</w:t>
+            </w:r>
+          </w:p>
+          <w:p>
+            <w:pPr>
+              <w:jc w:val="both"/>
+              <w:rPr>
+                <w:rFonts w:ascii="Arial" w:eastAsia="Arial" w:hAnsi="Arial" w:cs="Arial"/>
+                <w:sz w:val="20"/>
+                <w:szCs w:val="20"/>
+              </w:rPr>
+            </w:pPr>
+          </w:p>
+          <w:p>
+            <w:pPr>
+              <w:jc w:val="both"/>
+              <w:rPr>
+                <w:rFonts w:ascii="Arial" w:eastAsia="Arial" w:hAnsi="Arial" w:cs="Arial"/>
+                <w:sz w:val="20"/>
+                <w:szCs w:val="20"/>
+              </w:rPr>
+            </w:pPr>
+            <w:r>
+              <w:rPr>
+                <w:rFonts w:ascii="Arial" w:eastAsia="Arial" w:hAnsi="Arial" w:cs="Arial"/>
+                <w:sz w:val="20"/>
+                <w:szCs w:val="20"/>
+              </w:rPr>
               <w:t>Se recibió el documento Observaciones_Tablero_DEE.docx con el listado consolidado de correcciones por módulo. Cada ítem fue implementado, verificado y documentado en el commit correspondiente, dejando trazabilidad directa entre la solicitud de supervisión y la entrega técnica.</w:t>
             </w:r>
           </w:p>
           <w:p>
-            <w:r/>
-          </w:p>
-          <w:p>
-            <w:r>
-              <w:t>El material de soporte de la incidencia de servidor ocurrida el 19 de mayo —hilo de correo RE: Caída de servidor 172.17.0.46, radicado Aranda 28237, confirmación de restauración y verificación— se organizó en la carpeta de evidencias; la gestión detallada consta en la Obligación 8.</w:t>
-            </w:r>
-          </w:p>
-          <w:p>
-            <w:r/>
-          </w:p>
-          <w:p>
-            <w:r>
-              <w:t>Se actualizó la documentación técnica del proyecto (README.md, INDICE.md, AGENTS.md y Skill Pack) incorporando el flujo de despliegue seguro y las convenciones de desarrollo vigentes.</w:t>
-            </w:r>
-          </w:p>
-          <w:p>
-            <w:r/>
-          </w:p>
-          <w:p>
-            <w:r>
-              <w:t>Evidencia: carpeta informes del mes/evidencias mayo/, repositorios GitHub, SECOP II.</w:t>
+            <w:pPr>
+              <w:jc w:val="both"/>
+              <w:rPr>
+                <w:rFonts w:ascii="Arial" w:eastAsia="Arial" w:hAnsi="Arial" w:cs="Arial"/>
+                <w:sz w:val="20"/>
+                <w:szCs w:val="20"/>
+              </w:rPr>
+            </w:pPr>
+          </w:p>
+          <w:p>
+            <w:pPr>
+              <w:jc w:val="both"/>
+              <w:rPr>
+                <w:rFonts w:ascii="Arial" w:eastAsia="Arial" w:hAnsi="Arial" w:cs="Arial"/>
+                <w:sz w:val="20"/>
+                <w:szCs w:val="20"/>
+              </w:rPr>
+            </w:pPr>
+            <w:r>
+              <w:rPr>
+                <w:rFonts w:ascii="Arial" w:eastAsia="Arial" w:hAnsi="Arial" w:cs="Arial"/>
+                <w:sz w:val="20"/>
+                <w:szCs w:val="20"/>
+              </w:rPr>
+              <w:t>Se actualizó la documentación técnica del proyecto (README.md</w:t>
+            </w:r>
+            <w:r>
+              <w:rPr>
+                <w:rFonts w:ascii="Arial" w:eastAsia="Arial" w:hAnsi="Arial" w:cs="Arial"/>
+                <w:sz w:val="20"/>
+                <w:szCs w:val="20"/>
+              </w:rPr>
+              <w:t xml:space="preserve"> y</w:t>
+            </w:r>
+            <w:r>
+              <w:rPr>
+                <w:rFonts w:ascii="Arial" w:eastAsia="Arial" w:hAnsi="Arial" w:cs="Arial"/>
+                <w:sz w:val="20"/>
+                <w:szCs w:val="20"/>
+              </w:rPr>
+              <w:t xml:space="preserve"> INDICE.md</w:t>
+            </w:r>
+            <w:r>
+              <w:rPr>
+                <w:rFonts w:ascii="Arial" w:eastAsia="Arial" w:hAnsi="Arial" w:cs="Arial"/>
+                <w:sz w:val="20"/>
+                <w:szCs w:val="20"/>
+              </w:rPr>
+              <w:t xml:space="preserve">) </w:t>
+            </w:r>
+            <w:r>
+              <w:rPr>
+                <w:rFonts w:ascii="Arial" w:eastAsia="Arial" w:hAnsi="Arial" w:cs="Arial"/>
+                <w:sz w:val="20"/>
+                <w:szCs w:val="20"/>
+              </w:rPr>
+              <w:t>incorporando el flujo de despliegue seguro y las convenciones de desarrollo vigentes.</w:t>
             </w:r>
           </w:p>
         </w:tc>
@@ -2081,8 +2611,8 @@
         </w:tc>
         <w:tc>
           <w:tcPr>
-            <w:tcW w:w="4253" w:type="dxa"/>
-            <w:gridSpan w:val="8"/>
+            <w:tcW w:w="3545" w:type="dxa"/>
+            <w:gridSpan w:val="6"/>
             <w:vMerge/>
             <w:vAlign w:val="center"/>
           </w:tcPr>
@@ -2107,8 +2637,8 @@
         </w:tc>
         <w:tc>
           <w:tcPr>
-            <w:tcW w:w="5954" w:type="dxa"/>
-            <w:gridSpan w:val="9"/>
+            <w:tcW w:w="6804" w:type="dxa"/>
+            <w:gridSpan w:val="11"/>
             <w:vMerge/>
             <w:vAlign w:val="center"/>
           </w:tcPr>
@@ -2163,8 +2693,8 @@
         </w:tc>
         <w:tc>
           <w:tcPr>
-            <w:tcW w:w="4253" w:type="dxa"/>
-            <w:gridSpan w:val="8"/>
+            <w:tcW w:w="3545" w:type="dxa"/>
+            <w:gridSpan w:val="6"/>
             <w:vMerge/>
             <w:vAlign w:val="center"/>
           </w:tcPr>
@@ -2189,8 +2719,8 @@
         </w:tc>
         <w:tc>
           <w:tcPr>
-            <w:tcW w:w="5954" w:type="dxa"/>
-            <w:gridSpan w:val="9"/>
+            <w:tcW w:w="6804" w:type="dxa"/>
+            <w:gridSpan w:val="11"/>
             <w:vMerge/>
             <w:vAlign w:val="center"/>
           </w:tcPr>
@@ -2246,8 +2776,8 @@
         </w:tc>
         <w:tc>
           <w:tcPr>
-            <w:tcW w:w="4253" w:type="dxa"/>
-            <w:gridSpan w:val="8"/>
+            <w:tcW w:w="3545" w:type="dxa"/>
+            <w:gridSpan w:val="6"/>
             <w:vMerge w:val="restart"/>
             <w:vAlign w:val="center"/>
           </w:tcPr>
@@ -2274,38 +2804,83 @@
         </w:tc>
         <w:tc>
           <w:tcPr>
-            <w:tcW w:w="5954" w:type="dxa"/>
-            <w:gridSpan w:val="9"/>
+            <w:tcW w:w="6804" w:type="dxa"/>
+            <w:gridSpan w:val="11"/>
             <w:vMerge w:val="restart"/>
             <w:vAlign w:val="center"/>
           </w:tcPr>
           <w:p>
-            <w:r>
+            <w:pPr>
+              <w:jc w:val="both"/>
+              <w:rPr>
+                <w:rFonts w:ascii="Arial" w:eastAsia="Arial" w:hAnsi="Arial" w:cs="Arial"/>
+                <w:sz w:val="20"/>
+                <w:szCs w:val="20"/>
+              </w:rPr>
+            </w:pPr>
+            <w:r>
+              <w:rPr>
+                <w:rFonts w:ascii="Arial" w:eastAsia="Arial" w:hAnsi="Arial" w:cs="Arial"/>
+                <w:sz w:val="20"/>
+                <w:szCs w:val="20"/>
+              </w:rPr>
               <w:t>Se monitorearon diariamente los indicadores de avance en la ejecución de proyectos FNCER a través del Portal de Supervisión, que opera con datos reales de PostgreSQL sincronizados automáticamente desde las bases Excel del equipo de Supervisión. El tablero integra las correcciones de visualización y exportación implementadas durante el mes y descritas en la Obligación 2, garantizando que los indicadores de contratos, usuarios, valores y avance territorial estén actualizados.</w:t>
             </w:r>
           </w:p>
           <w:p>
-            <w:r/>
-          </w:p>
-          <w:p>
-            <w:r>
+            <w:pPr>
+              <w:jc w:val="both"/>
+              <w:rPr>
+                <w:rFonts w:ascii="Arial" w:eastAsia="Arial" w:hAnsi="Arial" w:cs="Arial"/>
+                <w:sz w:val="20"/>
+                <w:szCs w:val="20"/>
+              </w:rPr>
+            </w:pPr>
+          </w:p>
+          <w:p>
+            <w:pPr>
+              <w:jc w:val="both"/>
+              <w:rPr>
+                <w:rFonts w:ascii="Arial" w:eastAsia="Arial" w:hAnsi="Arial" w:cs="Arial"/>
+                <w:sz w:val="20"/>
+                <w:szCs w:val="20"/>
+              </w:rPr>
+            </w:pPr>
+            <w:r>
+              <w:rPr>
+                <w:rFonts w:ascii="Arial" w:eastAsia="Arial" w:hAnsi="Arial" w:cs="Arial"/>
+                <w:sz w:val="20"/>
+                <w:szCs w:val="20"/>
+              </w:rPr>
               <w:t>En el módulo de Gestión del Sector se monitorearon diariamente los KPIs del sistema eléctrico en tiempo real desde XM (precio de bolsa, generación, embalses y aportes hídricos), con clasificación de estado conforme a la metodología oficial XM/UPME.</w:t>
             </w:r>
           </w:p>
           <w:p>
-            <w:r/>
-          </w:p>
-          <w:p>
-            <w:r>
-              <w:t>Los informes ejecutivos automatizados enviados diariamente por correo y Telegram constituyeron el principal producto de monitoreo del período; incorporan las secciones DEE, fechas de corte explícitas y la distinción entre demanda regulada (residenciales) y no regulada (no residenciales).</w:t>
-            </w:r>
-          </w:p>
-          <w:p>
-            <w:r/>
-          </w:p>
-          <w:p>
-            <w:r>
-              <w:t>Evidencia: tablero Supervisión en producción, informes diarios en correo de supervisión, capturas carpeta evidencias mayo.</w:t>
+            <w:pPr>
+              <w:jc w:val="both"/>
+              <w:rPr>
+                <w:rFonts w:ascii="Arial" w:eastAsia="Arial" w:hAnsi="Arial" w:cs="Arial"/>
+                <w:sz w:val="20"/>
+                <w:szCs w:val="20"/>
+              </w:rPr>
+            </w:pPr>
+          </w:p>
+          <w:p>
+            <w:pPr>
+              <w:jc w:val="both"/>
+              <w:rPr>
+                <w:rFonts w:ascii="Arial" w:eastAsia="Arial" w:hAnsi="Arial" w:cs="Arial"/>
+                <w:sz w:val="20"/>
+                <w:szCs w:val="20"/>
+              </w:rPr>
+            </w:pPr>
+            <w:r>
+              <w:rPr>
+                <w:rFonts w:ascii="Arial" w:eastAsia="Arial" w:hAnsi="Arial" w:cs="Arial"/>
+                <w:sz w:val="20"/>
+                <w:szCs w:val="20"/>
+              </w:rPr>
+              <w:t>La mejora y corrección de los informes ejecutivos del sector energético automatizados se ha venido enviando diariamente por correo y Telegram, Junto con la automatización de las descargas de los informes del boletín Panorama Energético, constituyeron el principal producto de monitoreo del sector energético.</w:t>
             </w:r>
           </w:p>
         </w:tc>
@@ -2341,8 +2916,8 @@
         </w:tc>
         <w:tc>
           <w:tcPr>
-            <w:tcW w:w="4253" w:type="dxa"/>
-            <w:gridSpan w:val="8"/>
+            <w:tcW w:w="3545" w:type="dxa"/>
+            <w:gridSpan w:val="6"/>
             <w:vMerge/>
             <w:vAlign w:val="center"/>
           </w:tcPr>
@@ -2367,8 +2942,8 @@
         </w:tc>
         <w:tc>
           <w:tcPr>
-            <w:tcW w:w="5954" w:type="dxa"/>
-            <w:gridSpan w:val="9"/>
+            <w:tcW w:w="6804" w:type="dxa"/>
+            <w:gridSpan w:val="11"/>
             <w:vMerge/>
             <w:vAlign w:val="center"/>
           </w:tcPr>
@@ -2423,8 +2998,8 @@
         </w:tc>
         <w:tc>
           <w:tcPr>
-            <w:tcW w:w="4253" w:type="dxa"/>
-            <w:gridSpan w:val="8"/>
+            <w:tcW w:w="3545" w:type="dxa"/>
+            <w:gridSpan w:val="6"/>
             <w:vMerge/>
             <w:vAlign w:val="center"/>
           </w:tcPr>
@@ -2449,8 +3024,8 @@
         </w:tc>
         <w:tc>
           <w:tcPr>
-            <w:tcW w:w="5954" w:type="dxa"/>
-            <w:gridSpan w:val="9"/>
+            <w:tcW w:w="6804" w:type="dxa"/>
+            <w:gridSpan w:val="11"/>
             <w:vMerge/>
             <w:vAlign w:val="center"/>
           </w:tcPr>
@@ -2506,8 +3081,8 @@
         </w:tc>
         <w:tc>
           <w:tcPr>
-            <w:tcW w:w="4253" w:type="dxa"/>
-            <w:gridSpan w:val="8"/>
+            <w:tcW w:w="3545" w:type="dxa"/>
+            <w:gridSpan w:val="6"/>
             <w:vMerge w:val="restart"/>
             <w:vAlign w:val="center"/>
           </w:tcPr>
@@ -2534,38 +3109,83 @@
         </w:tc>
         <w:tc>
           <w:tcPr>
-            <w:tcW w:w="5954" w:type="dxa"/>
-            <w:gridSpan w:val="9"/>
+            <w:tcW w:w="6804" w:type="dxa"/>
+            <w:gridSpan w:val="11"/>
             <w:vMerge w:val="restart"/>
             <w:vAlign w:val="center"/>
           </w:tcPr>
           <w:p>
-            <w:r>
+            <w:pPr>
+              <w:jc w:val="both"/>
+              <w:rPr>
+                <w:rFonts w:ascii="Arial" w:eastAsia="Arial" w:hAnsi="Arial" w:cs="Arial"/>
+                <w:sz w:val="20"/>
+                <w:szCs w:val="20"/>
+              </w:rPr>
+            </w:pPr>
+            <w:r>
+              <w:rPr>
+                <w:rFonts w:ascii="Arial" w:eastAsia="Arial" w:hAnsi="Arial" w:cs="Arial"/>
+                <w:sz w:val="20"/>
+                <w:szCs w:val="20"/>
+              </w:rPr>
               <w:t>La coordinación con supervisión se sostuvo principalmente a través del documento Observaciones_Tablero_DEE.docx, que Diana Gutiérrez actualizaba diariamente con las correcciones derivadas de las reuniones que ella y Daniel Villarreal sostenían con cada equipo de la Dirección. Se recibían las actualizaciones del documento y se implementaban los cambios en el portal en orden de prioridad; la supervisión validaba los avances y ajustaba el estado de cada ítem conforme avanzaba la ejecución.</w:t>
             </w:r>
           </w:p>
           <w:p>
-            <w:r/>
-          </w:p>
-          <w:p>
-            <w:r>
-              <w:t>Para resolver dudas puntuales sobre la interpretación de solicitudes o la metodología de los datos, se sostuvieron sesiones de aclaración con Diana Gutiérrez según se requirió. Se realizó también una reunión de contexto con Santiago Santamaría sobre la metodología de cálculo del Costo Unitario.</w:t>
-            </w:r>
-          </w:p>
-          <w:p>
-            <w:r/>
-          </w:p>
-          <w:p>
-            <w:r>
+            <w:pPr>
+              <w:jc w:val="both"/>
+              <w:rPr>
+                <w:rFonts w:ascii="Arial" w:eastAsia="Arial" w:hAnsi="Arial" w:cs="Arial"/>
+                <w:sz w:val="20"/>
+                <w:szCs w:val="20"/>
+              </w:rPr>
+            </w:pPr>
+          </w:p>
+          <w:p>
+            <w:pPr>
+              <w:jc w:val="both"/>
+              <w:rPr>
+                <w:rFonts w:ascii="Arial" w:eastAsia="Arial" w:hAnsi="Arial" w:cs="Arial"/>
+                <w:sz w:val="20"/>
+                <w:szCs w:val="20"/>
+              </w:rPr>
+            </w:pPr>
+            <w:r>
+              <w:rPr>
+                <w:rFonts w:ascii="Arial" w:eastAsia="Arial" w:hAnsi="Arial" w:cs="Arial"/>
+                <w:sz w:val="20"/>
+                <w:szCs w:val="20"/>
+              </w:rPr>
+              <w:t xml:space="preserve">Para resolver dudas puntuales sobre la interpretación de solicitudes o la metodología de los datos, se sostuvieron sesiones de aclaración con Diana Gutiérrez según se requirió. </w:t>
+            </w:r>
+          </w:p>
+          <w:p>
+            <w:pPr>
+              <w:jc w:val="both"/>
+              <w:rPr>
+                <w:rFonts w:ascii="Arial" w:eastAsia="Arial" w:hAnsi="Arial" w:cs="Arial"/>
+                <w:sz w:val="20"/>
+                <w:szCs w:val="20"/>
+              </w:rPr>
+            </w:pPr>
+          </w:p>
+          <w:p>
+            <w:pPr>
+              <w:jc w:val="both"/>
+              <w:rPr>
+                <w:rFonts w:ascii="Arial" w:eastAsia="Arial" w:hAnsi="Arial" w:cs="Arial"/>
+                <w:sz w:val="20"/>
+                <w:szCs w:val="20"/>
+              </w:rPr>
+            </w:pPr>
+            <w:r>
+              <w:rPr>
+                <w:rFonts w:ascii="Arial" w:eastAsia="Arial" w:hAnsi="Arial" w:cs="Arial"/>
+                <w:sz w:val="20"/>
+                <w:szCs w:val="20"/>
+              </w:rPr>
               <w:t>Con ocasión de la indisponibilidad del servidor, se informó el problema de forma temprana a supervisión y se coordinó con el equipo de TIC la radicación del caso Aranda 28237; la cronología detallada consta en la Obligación 8.</w:t>
-            </w:r>
-          </w:p>
-          <w:p>
-            <w:r/>
-          </w:p>
-          <w:p>
-            <w:r>
-              <w:t>Evidencia: documento Observaciones_Tablero_DEE, correos y carpeta evidencias mayo / SECOP II.</w:t>
             </w:r>
           </w:p>
         </w:tc>
@@ -2601,8 +3221,8 @@
         </w:tc>
         <w:tc>
           <w:tcPr>
-            <w:tcW w:w="4253" w:type="dxa"/>
-            <w:gridSpan w:val="8"/>
+            <w:tcW w:w="3545" w:type="dxa"/>
+            <w:gridSpan w:val="6"/>
             <w:vMerge/>
             <w:vAlign w:val="center"/>
           </w:tcPr>
@@ -2627,8 +3247,8 @@
         </w:tc>
         <w:tc>
           <w:tcPr>
-            <w:tcW w:w="5954" w:type="dxa"/>
-            <w:gridSpan w:val="9"/>
+            <w:tcW w:w="6804" w:type="dxa"/>
+            <w:gridSpan w:val="11"/>
             <w:vMerge/>
             <w:vAlign w:val="center"/>
           </w:tcPr>
@@ -2683,8 +3303,8 @@
         </w:tc>
         <w:tc>
           <w:tcPr>
-            <w:tcW w:w="4253" w:type="dxa"/>
-            <w:gridSpan w:val="8"/>
+            <w:tcW w:w="3545" w:type="dxa"/>
+            <w:gridSpan w:val="6"/>
             <w:vMerge/>
             <w:vAlign w:val="center"/>
           </w:tcPr>
@@ -2709,8 +3329,8 @@
         </w:tc>
         <w:tc>
           <w:tcPr>
-            <w:tcW w:w="5954" w:type="dxa"/>
-            <w:gridSpan w:val="9"/>
+            <w:tcW w:w="6804" w:type="dxa"/>
+            <w:gridSpan w:val="11"/>
             <w:vMerge/>
             <w:vAlign w:val="center"/>
           </w:tcPr>
@@ -2766,8 +3386,8 @@
         </w:tc>
         <w:tc>
           <w:tcPr>
-            <w:tcW w:w="4253" w:type="dxa"/>
-            <w:gridSpan w:val="8"/>
+            <w:tcW w:w="3545" w:type="dxa"/>
+            <w:gridSpan w:val="6"/>
             <w:vMerge w:val="restart"/>
             <w:vAlign w:val="center"/>
           </w:tcPr>
@@ -2781,36 +3401,89 @@
                 <w:sz w:val="20"/>
                 <w:szCs w:val="20"/>
               </w:rPr>
-              <w:t>Organizar sesiones de retroalimentación para mejorar las guías y protocolos basados en experiencias del equipo, a fin de monitorear el uso de herramientas y proporcionar soporte para resolver incidencias.</w:t>
-            </w:r>
-          </w:p>
-        </w:tc>
-        <w:tc>
-          <w:tcPr>
-            <w:tcW w:w="5954" w:type="dxa"/>
-            <w:gridSpan w:val="9"/>
+              <w:t xml:space="preserve">Organizar sesiones de retroalimentación para mejorar las guías y protocolos basados en experiencias del equipo, a fin de monitorear el uso de herramientas y </w:t>
+            </w:r>
+            <w:r>
+              <w:rPr>
+                <w:rFonts w:ascii="Arial" w:eastAsia="Arial" w:hAnsi="Arial" w:cs="Arial"/>
+                <w:sz w:val="20"/>
+                <w:szCs w:val="20"/>
+              </w:rPr>
+              <w:lastRenderedPageBreak/>
+              <w:t>proporcionar soporte para resolver incidencias.</w:t>
+            </w:r>
+          </w:p>
+        </w:tc>
+        <w:tc>
+          <w:tcPr>
+            <w:tcW w:w="6804" w:type="dxa"/>
+            <w:gridSpan w:val="11"/>
             <w:vMerge w:val="restart"/>
             <w:vAlign w:val="center"/>
           </w:tcPr>
           <w:p>
-            <w:r>
-              <w:t>Se formalizó el protocolo de atención de observaciones a tableros: la supervisión consolida las correcciones de cada equipo en el documento Observaciones_Tablero_DEE.docx; se implementan en el portal en orden de prioridad; y la supervisión valida e incorpora nuevas solicitudes diariamente. Este flujo, aplicado a seis módulos durante el mes, quedó documentado como procedimiento de trabajo para los meses siguientes.</w:t>
-            </w:r>
-          </w:p>
-          <w:p>
-            <w:r/>
-          </w:p>
-          <w:p>
-            <w:r>
-              <w:t>Se elaboró y compartió con la supervisión el documento de configuración del sistema de alertas automatizadas de Gestión del Sector, con la definición de umbrales por módulo y las reglas de notificación, incluida la consulta sobre el embalse Topocoro.</w:t>
-            </w:r>
-          </w:p>
-          <w:p>
-            <w:r/>
-          </w:p>
-          <w:p>
-            <w:r>
-              <w:t>Evidencia: documento Observaciones_Tablero_DEE, documento de configuración de alertas.</w:t>
+            <w:pPr>
+              <w:jc w:val="both"/>
+              <w:rPr>
+                <w:rFonts w:ascii="Arial" w:eastAsia="Arial" w:hAnsi="Arial" w:cs="Arial"/>
+                <w:sz w:val="20"/>
+                <w:szCs w:val="20"/>
+              </w:rPr>
+            </w:pPr>
+          </w:p>
+          <w:p>
+            <w:pPr>
+              <w:jc w:val="both"/>
+              <w:rPr>
+                <w:rFonts w:ascii="Arial" w:eastAsia="Arial" w:hAnsi="Arial" w:cs="Arial"/>
+                <w:sz w:val="20"/>
+                <w:szCs w:val="20"/>
+              </w:rPr>
+            </w:pPr>
+            <w:r>
+              <w:rPr>
+                <w:rFonts w:ascii="Arial" w:eastAsia="Arial" w:hAnsi="Arial" w:cs="Arial"/>
+                <w:sz w:val="20"/>
+                <w:szCs w:val="20"/>
+              </w:rPr>
+              <w:t xml:space="preserve">Se formalizó el protocolo de atención de observaciones a tableros: la supervisión consolida las correcciones de cada equipo en el documento Observaciones_Tablero_DEE.docx; se implementan en el portal en orden de prioridad; y la supervisión valida e incorpora nuevas solicitudes </w:t>
+            </w:r>
+            <w:r>
+              <w:rPr>
+                <w:rFonts w:ascii="Arial" w:eastAsia="Arial" w:hAnsi="Arial" w:cs="Arial"/>
+                <w:sz w:val="20"/>
+                <w:szCs w:val="20"/>
+              </w:rPr>
+              <w:lastRenderedPageBreak/>
+              <w:t>diariamente. Este flujo, aplicado a seis módulos durante el mes, quedó documentado como procedimiento de trabajo para los meses siguientes.</w:t>
+            </w:r>
+          </w:p>
+          <w:p>
+            <w:pPr>
+              <w:jc w:val="both"/>
+              <w:rPr>
+                <w:rFonts w:ascii="Arial" w:eastAsia="Arial" w:hAnsi="Arial" w:cs="Arial"/>
+                <w:sz w:val="20"/>
+                <w:szCs w:val="20"/>
+              </w:rPr>
+            </w:pPr>
+          </w:p>
+          <w:p>
+            <w:pPr>
+              <w:jc w:val="both"/>
+              <w:rPr>
+                <w:rFonts w:ascii="Arial" w:eastAsia="Arial" w:hAnsi="Arial" w:cs="Arial"/>
+                <w:sz w:val="20"/>
+                <w:szCs w:val="20"/>
+              </w:rPr>
+            </w:pPr>
+            <w:r>
+              <w:rPr>
+                <w:rFonts w:ascii="Arial" w:eastAsia="Arial" w:hAnsi="Arial" w:cs="Arial"/>
+                <w:sz w:val="20"/>
+                <w:szCs w:val="20"/>
+              </w:rPr>
+              <w:t>Se elaboró y compartió con la supervisión el documento de configuración del sistema de alertas automatizadas de Gestión del Sector, con la definición de umbrales por módulo y las reglas de notificación.</w:t>
             </w:r>
           </w:p>
         </w:tc>
@@ -2846,8 +3519,8 @@
         </w:tc>
         <w:tc>
           <w:tcPr>
-            <w:tcW w:w="4253" w:type="dxa"/>
-            <w:gridSpan w:val="8"/>
+            <w:tcW w:w="3545" w:type="dxa"/>
+            <w:gridSpan w:val="6"/>
             <w:vMerge/>
             <w:vAlign w:val="center"/>
           </w:tcPr>
@@ -2872,8 +3545,8 @@
         </w:tc>
         <w:tc>
           <w:tcPr>
-            <w:tcW w:w="5954" w:type="dxa"/>
-            <w:gridSpan w:val="9"/>
+            <w:tcW w:w="6804" w:type="dxa"/>
+            <w:gridSpan w:val="11"/>
             <w:vMerge/>
             <w:vAlign w:val="center"/>
           </w:tcPr>
@@ -2928,8 +3601,8 @@
         </w:tc>
         <w:tc>
           <w:tcPr>
-            <w:tcW w:w="4253" w:type="dxa"/>
-            <w:gridSpan w:val="8"/>
+            <w:tcW w:w="3545" w:type="dxa"/>
+            <w:gridSpan w:val="6"/>
             <w:vMerge/>
             <w:vAlign w:val="center"/>
           </w:tcPr>
@@ -2954,8 +3627,8 @@
         </w:tc>
         <w:tc>
           <w:tcPr>
-            <w:tcW w:w="5954" w:type="dxa"/>
-            <w:gridSpan w:val="9"/>
+            <w:tcW w:w="6804" w:type="dxa"/>
+            <w:gridSpan w:val="11"/>
             <w:vMerge/>
             <w:vAlign w:val="center"/>
           </w:tcPr>
@@ -3011,8 +3684,8 @@
         </w:tc>
         <w:tc>
           <w:tcPr>
-            <w:tcW w:w="4253" w:type="dxa"/>
-            <w:gridSpan w:val="8"/>
+            <w:tcW w:w="3545" w:type="dxa"/>
+            <w:gridSpan w:val="6"/>
             <w:vMerge w:val="restart"/>
             <w:vAlign w:val="center"/>
           </w:tcPr>
@@ -3038,62 +3711,177 @@
         </w:tc>
         <w:tc>
           <w:tcPr>
-            <w:tcW w:w="5954" w:type="dxa"/>
-            <w:gridSpan w:val="9"/>
+            <w:tcW w:w="6804" w:type="dxa"/>
+            <w:gridSpan w:val="11"/>
             <w:vMerge w:val="restart"/>
             <w:vAlign w:val="center"/>
           </w:tcPr>
           <w:p>
-            <w:r>
+            <w:pPr>
+              <w:jc w:val="both"/>
+              <w:rPr>
+                <w:rFonts w:ascii="Arial" w:eastAsia="Arial" w:hAnsi="Arial" w:cs="Arial"/>
+                <w:sz w:val="20"/>
+                <w:szCs w:val="20"/>
+              </w:rPr>
+            </w:pPr>
+          </w:p>
+          <w:p>
+            <w:pPr>
+              <w:jc w:val="both"/>
+              <w:rPr>
+                <w:rFonts w:ascii="Arial" w:eastAsia="Arial" w:hAnsi="Arial" w:cs="Arial"/>
+                <w:sz w:val="20"/>
+                <w:szCs w:val="20"/>
+              </w:rPr>
+            </w:pPr>
+            <w:r>
+              <w:rPr>
+                <w:rFonts w:ascii="Arial" w:eastAsia="Arial" w:hAnsi="Arial" w:cs="Arial"/>
+                <w:sz w:val="20"/>
+                <w:szCs w:val="20"/>
+              </w:rPr>
               <w:t>Se elaboraron y entregaron los siguientes materiales técnicos y administrativos:</w:t>
             </w:r>
           </w:p>
           <w:p>
-            <w:r/>
-          </w:p>
-          <w:p>
-            <w:r>
+            <w:pPr>
+              <w:jc w:val="both"/>
+              <w:rPr>
+                <w:rFonts w:ascii="Arial" w:eastAsia="Arial" w:hAnsi="Arial" w:cs="Arial"/>
+                <w:sz w:val="20"/>
+                <w:szCs w:val="20"/>
+              </w:rPr>
+            </w:pPr>
+          </w:p>
+          <w:p>
+            <w:pPr>
+              <w:jc w:val="both"/>
+              <w:rPr>
+                <w:rFonts w:ascii="Arial" w:eastAsia="Arial" w:hAnsi="Arial" w:cs="Arial"/>
+                <w:sz w:val="20"/>
+                <w:szCs w:val="20"/>
+              </w:rPr>
+            </w:pPr>
+            <w:r>
+              <w:rPr>
+                <w:rFonts w:ascii="Arial" w:eastAsia="Arial" w:hAnsi="Arial" w:cs="Arial"/>
+                <w:sz w:val="20"/>
+                <w:szCs w:val="20"/>
+              </w:rPr>
               <w:t>Informe técnico de la metodología, parametrización y filtrado aplicados para la obtención de los beneficiarios del departamento de Sucre.</w:t>
             </w:r>
           </w:p>
           <w:p>
-            <w:r/>
-          </w:p>
-          <w:p>
-            <w:r>
+            <w:pPr>
+              <w:jc w:val="both"/>
+              <w:rPr>
+                <w:rFonts w:ascii="Arial" w:eastAsia="Arial" w:hAnsi="Arial" w:cs="Arial"/>
+                <w:sz w:val="20"/>
+                <w:szCs w:val="20"/>
+              </w:rPr>
+            </w:pPr>
+          </w:p>
+          <w:p>
+            <w:pPr>
+              <w:jc w:val="both"/>
+              <w:rPr>
+                <w:rFonts w:ascii="Arial" w:eastAsia="Arial" w:hAnsi="Arial" w:cs="Arial"/>
+                <w:sz w:val="20"/>
+                <w:szCs w:val="20"/>
+              </w:rPr>
+            </w:pPr>
+            <w:r>
+              <w:rPr>
+                <w:rFonts w:ascii="Arial" w:eastAsia="Arial" w:hAnsi="Arial" w:cs="Arial"/>
+                <w:sz w:val="20"/>
+                <w:szCs w:val="20"/>
+              </w:rPr>
               <w:t>Informe estandarizado de la Dirección de Energía Eléctrica (25 al 27 de mayo): documento diario unificado con la estructura que recibe el jefe de la Dirección, que incluye los despachos de generación térmica con enlace a Sinergox XM, la tabla de hidrología, las demandas del SIN, fechas de corte explícitas y la distinción entre demanda regulada y no regulada. Las secciones específicas DEE (subsidios, supervisión, apropiación presupuestal y comunidades) quedaron pendientes de ajuste final.</w:t>
             </w:r>
           </w:p>
           <w:p>
-            <w:r/>
-          </w:p>
-          <w:p>
-            <w:r>
+            <w:pPr>
+              <w:jc w:val="both"/>
+              <w:rPr>
+                <w:rFonts w:ascii="Arial" w:eastAsia="Arial" w:hAnsi="Arial" w:cs="Arial"/>
+                <w:sz w:val="20"/>
+                <w:szCs w:val="20"/>
+              </w:rPr>
+            </w:pPr>
+          </w:p>
+          <w:p>
+            <w:pPr>
+              <w:jc w:val="both"/>
+              <w:rPr>
+                <w:rFonts w:ascii="Arial" w:eastAsia="Arial" w:hAnsi="Arial" w:cs="Arial"/>
+                <w:sz w:val="20"/>
+                <w:szCs w:val="20"/>
+              </w:rPr>
+            </w:pPr>
+            <w:r>
+              <w:rPr>
+                <w:rFonts w:ascii="Arial" w:eastAsia="Arial" w:hAnsi="Arial" w:cs="Arial"/>
+                <w:sz w:val="20"/>
+                <w:szCs w:val="20"/>
+              </w:rPr>
               <w:t>Botón flotante Resumen Ejecutivo en el portal (solicitud de supervisión, finales de mayo): descarga el PDF del informe ejecutivo diario enviado también por correo y Telegram. Se incorporaron adicionalmente el botón de descarga del boletín Panorama Energético y el botón de descarga de informes PDF de XM en el slide de Gestión del Sector.</w:t>
             </w:r>
           </w:p>
           <w:p>
-            <w:r/>
-          </w:p>
-          <w:p>
-            <w:r>
+            <w:pPr>
+              <w:jc w:val="both"/>
+              <w:rPr>
+                <w:rFonts w:ascii="Arial" w:eastAsia="Arial" w:hAnsi="Arial" w:cs="Arial"/>
+                <w:sz w:val="20"/>
+                <w:szCs w:val="20"/>
+              </w:rPr>
+            </w:pPr>
+          </w:p>
+          <w:p>
+            <w:pPr>
+              <w:jc w:val="both"/>
+              <w:rPr>
+                <w:rFonts w:ascii="Arial" w:eastAsia="Arial" w:hAnsi="Arial" w:cs="Arial"/>
+                <w:sz w:val="20"/>
+                <w:szCs w:val="20"/>
+              </w:rPr>
+            </w:pPr>
+            <w:r>
+              <w:rPr>
+                <w:rFonts w:ascii="Arial" w:eastAsia="Arial" w:hAnsi="Arial" w:cs="Arial"/>
+                <w:sz w:val="20"/>
+                <w:szCs w:val="20"/>
+              </w:rPr>
               <w:t>Materiales de soporte técnico: documentación de la refactorización del HomeSlider, actualización de AGENTS.md, suite de 49 pruebas Vitest y guía de despliegue seguro post-incidente.</w:t>
             </w:r>
           </w:p>
           <w:p>
-            <w:r/>
-          </w:p>
-          <w:p>
-            <w:r>
+            <w:pPr>
+              <w:jc w:val="both"/>
+              <w:rPr>
+                <w:rFonts w:ascii="Arial" w:eastAsia="Arial" w:hAnsi="Arial" w:cs="Arial"/>
+                <w:sz w:val="20"/>
+                <w:szCs w:val="20"/>
+              </w:rPr>
+            </w:pPr>
+          </w:p>
+          <w:p>
+            <w:pPr>
+              <w:jc w:val="both"/>
+              <w:rPr>
+                <w:rFonts w:ascii="Arial" w:eastAsia="Arial" w:hAnsi="Arial" w:cs="Arial"/>
+                <w:sz w:val="20"/>
+                <w:szCs w:val="20"/>
+              </w:rPr>
+            </w:pPr>
+            <w:r>
+              <w:rPr>
+                <w:rFonts w:ascii="Arial" w:eastAsia="Arial" w:hAnsi="Arial" w:cs="Arial"/>
+                <w:sz w:val="20"/>
+                <w:szCs w:val="20"/>
+              </w:rPr>
               <w:t>Presente informe mensual de actividades, Pago 5 de 12, período 01/05-30/05/2026.</w:t>
-            </w:r>
-          </w:p>
-          <w:p>
-            <w:r/>
-          </w:p>
-          <w:p>
-            <w:r>
-              <w:t>Evidencia: informe técnico Sucre, informe diario en correo supervisión, portal en producción, presente documento.</w:t>
             </w:r>
           </w:p>
         </w:tc>
@@ -3129,8 +3917,8 @@
         </w:tc>
         <w:tc>
           <w:tcPr>
-            <w:tcW w:w="4253" w:type="dxa"/>
-            <w:gridSpan w:val="8"/>
+            <w:tcW w:w="3545" w:type="dxa"/>
+            <w:gridSpan w:val="6"/>
             <w:vMerge/>
             <w:vAlign w:val="center"/>
           </w:tcPr>
@@ -3155,8 +3943,8 @@
         </w:tc>
         <w:tc>
           <w:tcPr>
-            <w:tcW w:w="5954" w:type="dxa"/>
-            <w:gridSpan w:val="9"/>
+            <w:tcW w:w="6804" w:type="dxa"/>
+            <w:gridSpan w:val="11"/>
             <w:vMerge/>
             <w:vAlign w:val="center"/>
           </w:tcPr>
@@ -3211,8 +3999,8 @@
         </w:tc>
         <w:tc>
           <w:tcPr>
-            <w:tcW w:w="4253" w:type="dxa"/>
-            <w:gridSpan w:val="8"/>
+            <w:tcW w:w="3545" w:type="dxa"/>
+            <w:gridSpan w:val="6"/>
             <w:vMerge/>
             <w:vAlign w:val="center"/>
           </w:tcPr>
@@ -3237,8 +4025,8 @@
         </w:tc>
         <w:tc>
           <w:tcPr>
-            <w:tcW w:w="5954" w:type="dxa"/>
-            <w:gridSpan w:val="9"/>
+            <w:tcW w:w="6804" w:type="dxa"/>
+            <w:gridSpan w:val="11"/>
             <w:vMerge/>
             <w:vAlign w:val="center"/>
           </w:tcPr>
@@ -3294,8 +4082,8 @@
         </w:tc>
         <w:tc>
           <w:tcPr>
-            <w:tcW w:w="4253" w:type="dxa"/>
-            <w:gridSpan w:val="8"/>
+            <w:tcW w:w="3545" w:type="dxa"/>
+            <w:gridSpan w:val="6"/>
             <w:vMerge w:val="restart"/>
             <w:vAlign w:val="center"/>
           </w:tcPr>
@@ -3321,38 +4109,100 @@
         </w:tc>
         <w:tc>
           <w:tcPr>
-            <w:tcW w:w="5954" w:type="dxa"/>
-            <w:gridSpan w:val="9"/>
+            <w:tcW w:w="6804" w:type="dxa"/>
+            <w:gridSpan w:val="11"/>
             <w:vMerge w:val="restart"/>
             <w:vAlign w:val="center"/>
           </w:tcPr>
           <w:p>
-            <w:r>
+            <w:pPr>
+              <w:jc w:val="both"/>
+              <w:rPr>
+                <w:rFonts w:ascii="Arial" w:eastAsia="Arial" w:hAnsi="Arial" w:cs="Arial"/>
+                <w:sz w:val="20"/>
+                <w:szCs w:val="20"/>
+              </w:rPr>
+            </w:pPr>
+            <w:r>
+              <w:rPr>
+                <w:rFonts w:ascii="Arial" w:eastAsia="Arial" w:hAnsi="Arial" w:cs="Arial"/>
+                <w:sz w:val="20"/>
+                <w:szCs w:val="20"/>
+              </w:rPr>
               <w:t>Se cumplieron las funciones adicionales asignadas por el supervisor. Los desarrollos del mes respondieron a la directriz del Viceministro de centralizar los avances de todos los grupos de la Dirección en el Portal de Dirección; el detalle consta en la Obligación 2.</w:t>
             </w:r>
           </w:p>
           <w:p>
-            <w:r/>
-          </w:p>
-          <w:p>
-            <w:r>
+            <w:pPr>
+              <w:jc w:val="both"/>
+              <w:rPr>
+                <w:rFonts w:ascii="Arial" w:eastAsia="Arial" w:hAnsi="Arial" w:cs="Arial"/>
+                <w:sz w:val="20"/>
+                <w:szCs w:val="20"/>
+              </w:rPr>
+            </w:pPr>
+          </w:p>
+          <w:p>
+            <w:pPr>
+              <w:jc w:val="both"/>
+              <w:rPr>
+                <w:rFonts w:ascii="Arial" w:eastAsia="Arial" w:hAnsi="Arial" w:cs="Arial"/>
+                <w:sz w:val="20"/>
+                <w:szCs w:val="20"/>
+              </w:rPr>
+            </w:pPr>
+            <w:r>
+              <w:rPr>
+                <w:rFonts w:ascii="Arial" w:eastAsia="Arial" w:hAnsi="Arial" w:cs="Arial"/>
+                <w:sz w:val="20"/>
+                <w:szCs w:val="20"/>
+              </w:rPr>
               <w:t>Respecto a la incidencia del servidor, la cronología de la gestión fue la siguiente: el 18 de mayo se detectaron fallas de conexión SSH; el 19 de mayo el servidor 172.17.0.46 (SRVWEBPRDCTRLXM) perdió funcionamiento y accesibilidad; el 24 de mayo a las 17:04 el Viceministerio (Sr. Víctor Paternina) elevó la solicitud de atención prioritaria a TIC; el 25 de mayo a las 8:30 TIC realizó una sesión de revisión e intentó medidas correctivas, incluida la propuesta de una segunda tarjeta de red con IP alternativa, sin lograr restablecer la conexión SSH; a las 14:45 el contratista Nicolás Maldonado radicó el caso Aranda 28237 solicitando la restauración al estado del 17 de mayo; a las 15:07 TIC ejecutó la restauración al snapshot del 18/05/2026 a las 5:56 a.m.; y a las 20:32 se confirmó el acceso SSH y el funcionamiento del portal. La parametrización de infraestructura es competencia exclusiva de TIC.</w:t>
             </w:r>
           </w:p>
           <w:p>
-            <w:r/>
-          </w:p>
-          <w:p>
-            <w:r>
-              <w:t>Se mantuvo durante el mes el chatbot de Telegram, los despliegues de producción con PM2 y la sincronización SharePoint-PostgreSQL, en los períodos en que el servidor estuvo disponible. Se reportaron a supervisión como pendientes para junio los tableros de hidrocarburos, los ajustes visuales finos y el refinamiento del tablero de Costo Unitario.</w:t>
-            </w:r>
-          </w:p>
-          <w:p>
-            <w:r/>
-          </w:p>
-          <w:p>
-            <w:r>
-              <w:t>Evidencia: portal en producción, carpeta evidencias mayo, commits GitHub mayo 2026, correo Aranda 28237.</w:t>
+            <w:pPr>
+              <w:jc w:val="both"/>
+              <w:rPr>
+                <w:rFonts w:ascii="Arial" w:eastAsia="Arial" w:hAnsi="Arial" w:cs="Arial"/>
+                <w:sz w:val="20"/>
+                <w:szCs w:val="20"/>
+              </w:rPr>
+            </w:pPr>
+          </w:p>
+          <w:p>
+            <w:pPr>
+              <w:jc w:val="both"/>
+              <w:rPr>
+                <w:rFonts w:ascii="Arial" w:eastAsia="Arial" w:hAnsi="Arial" w:cs="Arial"/>
+                <w:sz w:val="20"/>
+                <w:szCs w:val="20"/>
+              </w:rPr>
+            </w:pPr>
+            <w:r>
+              <w:rPr>
+                <w:rFonts w:ascii="Arial" w:eastAsia="Arial" w:hAnsi="Arial" w:cs="Arial"/>
+                <w:sz w:val="20"/>
+                <w:szCs w:val="20"/>
+              </w:rPr>
+              <w:lastRenderedPageBreak/>
+              <w:t>Se mantuvo durante el mes el chatbot de Telegram, los despliegues de producción con PM2 y la sincronización SharePoint-PostgreSQL, en los períodos en que el servidor estuvo disponible. Se reportaron a supervisión como pendientes para junio los tableros de hidrocarburo</w:t>
+            </w:r>
+            <w:r>
+              <w:rPr>
+                <w:rFonts w:ascii="Arial" w:eastAsia="Arial" w:hAnsi="Arial" w:cs="Arial"/>
+                <w:sz w:val="20"/>
+                <w:szCs w:val="20"/>
+              </w:rPr>
+              <w:t xml:space="preserve">s y </w:t>
+            </w:r>
+            <w:r>
+              <w:rPr>
+                <w:rFonts w:ascii="Arial" w:eastAsia="Arial" w:hAnsi="Arial" w:cs="Arial"/>
+                <w:sz w:val="20"/>
+                <w:szCs w:val="20"/>
+              </w:rPr>
+              <w:t>los ajustes visuales finos.</w:t>
             </w:r>
           </w:p>
         </w:tc>
@@ -3388,8 +4238,8 @@
         </w:tc>
         <w:tc>
           <w:tcPr>
-            <w:tcW w:w="4253" w:type="dxa"/>
-            <w:gridSpan w:val="8"/>
+            <w:tcW w:w="3545" w:type="dxa"/>
+            <w:gridSpan w:val="6"/>
             <w:vMerge/>
             <w:vAlign w:val="center"/>
           </w:tcPr>
@@ -3414,8 +4264,8 @@
         </w:tc>
         <w:tc>
           <w:tcPr>
-            <w:tcW w:w="5954" w:type="dxa"/>
-            <w:gridSpan w:val="9"/>
+            <w:tcW w:w="6804" w:type="dxa"/>
+            <w:gridSpan w:val="11"/>
             <w:vMerge/>
             <w:vAlign w:val="center"/>
           </w:tcPr>
@@ -3470,8 +4320,8 @@
         </w:tc>
         <w:tc>
           <w:tcPr>
-            <w:tcW w:w="4253" w:type="dxa"/>
-            <w:gridSpan w:val="8"/>
+            <w:tcW w:w="3545" w:type="dxa"/>
+            <w:gridSpan w:val="6"/>
             <w:vMerge/>
             <w:vAlign w:val="center"/>
           </w:tcPr>
@@ -3496,8 +4346,8 @@
         </w:tc>
         <w:tc>
           <w:tcPr>
-            <w:tcW w:w="5954" w:type="dxa"/>
-            <w:gridSpan w:val="9"/>
+            <w:tcW w:w="6804" w:type="dxa"/>
+            <w:gridSpan w:val="11"/>
             <w:vMerge/>
             <w:vAlign w:val="center"/>
           </w:tcPr>
@@ -3527,7 +4377,7 @@
         </w:trPr>
         <w:tc>
           <w:tcPr>
-            <w:tcW w:w="10774" w:type="dxa"/>
+            <w:tcW w:w="10916" w:type="dxa"/>
             <w:gridSpan w:val="18"/>
             <w:shd w:val="clear" w:color="auto" w:fill="ACB9CA"/>
             <w:vAlign w:val="center"/>
@@ -3603,7 +4453,7 @@
         </w:tc>
         <w:tc>
           <w:tcPr>
-            <w:tcW w:w="4971" w:type="dxa"/>
+            <w:tcW w:w="5113" w:type="dxa"/>
             <w:gridSpan w:val="7"/>
             <w:shd w:val="clear" w:color="auto" w:fill="D9D9D9" w:themeFill="background1" w:themeFillShade="D9"/>
             <w:vAlign w:val="center"/>
@@ -3688,13 +4538,29 @@
         </w:tc>
         <w:tc>
           <w:tcPr>
-            <w:tcW w:w="4971" w:type="dxa"/>
+            <w:tcW w:w="5113" w:type="dxa"/>
             <w:gridSpan w:val="7"/>
             <w:vAlign w:val="center"/>
           </w:tcPr>
           <w:p>
-            <w:r>
-              <w:t>Se presenta informe de actividades del período 01/05/2026 al 30/05/2026 (Pago 5 de 12).</w:t>
+            <w:pPr>
+              <w:jc w:val="both"/>
+              <w:rPr>
+                <w:rFonts w:ascii="Arial" w:eastAsia="Arial" w:hAnsi="Arial" w:cs="Arial"/>
+                <w:b/>
+                <w:bCs/>
+                <w:color w:val="FF0000"/>
+                <w:sz w:val="20"/>
+                <w:szCs w:val="20"/>
+              </w:rPr>
+            </w:pPr>
+            <w:r>
+              <w:rPr>
+                <w:rFonts w:ascii="Arial" w:eastAsia="Arial" w:hAnsi="Arial" w:cs="Arial"/>
+                <w:sz w:val="20"/>
+                <w:szCs w:val="20"/>
+              </w:rPr>
+              <w:t>Se presenta informe de actividades realizadas</w:t>
             </w:r>
           </w:p>
         </w:tc>
@@ -3756,7 +4622,7 @@
         </w:tc>
         <w:tc>
           <w:tcPr>
-            <w:tcW w:w="4971" w:type="dxa"/>
+            <w:tcW w:w="5113" w:type="dxa"/>
             <w:gridSpan w:val="7"/>
             <w:vAlign w:val="center"/>
           </w:tcPr>
@@ -3837,13 +4703,26 @@
         </w:tc>
         <w:tc>
           <w:tcPr>
-            <w:tcW w:w="4971" w:type="dxa"/>
+            <w:tcW w:w="5113" w:type="dxa"/>
             <w:gridSpan w:val="7"/>
             <w:vAlign w:val="center"/>
           </w:tcPr>
           <w:p>
-            <w:r>
-              <w:t>Se asiste de manera presencial o virtual a las reuniones citadas por el supervisor. Durante mayo se participó en las reuniones de revisión de tableros con los seis equipos de la Dirección de Energía Eléctrica y en las sesiones de seguimiento diario con la supervisión.</w:t>
+            <w:pPr>
+              <w:jc w:val="both"/>
+              <w:rPr>
+                <w:rFonts w:ascii="Arial" w:eastAsia="Arial" w:hAnsi="Arial" w:cs="Arial"/>
+                <w:sz w:val="20"/>
+                <w:szCs w:val="20"/>
+              </w:rPr>
+            </w:pPr>
+            <w:r>
+              <w:rPr>
+                <w:rFonts w:ascii="Arial" w:eastAsia="Arial" w:hAnsi="Arial" w:cs="Arial"/>
+                <w:sz w:val="20"/>
+                <w:szCs w:val="20"/>
+              </w:rPr>
+              <w:t>Se asiste de manera presencial o virtual a las reuniones citadas por el supervisor.</w:t>
             </w:r>
           </w:p>
         </w:tc>
@@ -3905,13 +4784,26 @@
         </w:tc>
         <w:tc>
           <w:tcPr>
-            <w:tcW w:w="4971" w:type="dxa"/>
+            <w:tcW w:w="5113" w:type="dxa"/>
             <w:gridSpan w:val="7"/>
             <w:vAlign w:val="center"/>
           </w:tcPr>
           <w:p>
-            <w:r>
-              <w:t>Se mantiene la información actualizada y organizada en los sistemas de información del Ministerio. El portal está sincronizado con bases reales vía SharePoint y PostgreSQL; los tableros operan con datos actualizados y sin información de prueba.</w:t>
+            <w:pPr>
+              <w:jc w:val="both"/>
+              <w:rPr>
+                <w:rFonts w:ascii="Arial" w:eastAsia="Arial" w:hAnsi="Arial" w:cs="Arial"/>
+                <w:sz w:val="20"/>
+                <w:szCs w:val="20"/>
+              </w:rPr>
+            </w:pPr>
+            <w:r>
+              <w:rPr>
+                <w:rFonts w:ascii="Arial" w:eastAsia="Arial" w:hAnsi="Arial" w:cs="Arial"/>
+                <w:sz w:val="20"/>
+                <w:szCs w:val="20"/>
+              </w:rPr>
+              <w:t>Se mantiene la información actualizada y organizada.</w:t>
             </w:r>
           </w:p>
         </w:tc>
@@ -3984,7 +4876,7 @@
         </w:tc>
         <w:tc>
           <w:tcPr>
-            <w:tcW w:w="4971" w:type="dxa"/>
+            <w:tcW w:w="5113" w:type="dxa"/>
             <w:gridSpan w:val="7"/>
             <w:vAlign w:val="center"/>
           </w:tcPr>
@@ -4003,7 +4895,6 @@
                 <w:sz w:val="20"/>
                 <w:szCs w:val="20"/>
               </w:rPr>
-              <w:lastRenderedPageBreak/>
               <w:t>Se gestionan oportunamente todos los trámites y documentos asignados por los aplicativos institucionales.</w:t>
             </w:r>
           </w:p>
@@ -4066,7 +4957,7 @@
         </w:tc>
         <w:tc>
           <w:tcPr>
-            <w:tcW w:w="4971" w:type="dxa"/>
+            <w:tcW w:w="5113" w:type="dxa"/>
             <w:gridSpan w:val="7"/>
             <w:vAlign w:val="center"/>
           </w:tcPr>
@@ -4147,7 +5038,7 @@
         </w:tc>
         <w:tc>
           <w:tcPr>
-            <w:tcW w:w="4971" w:type="dxa"/>
+            <w:tcW w:w="5113" w:type="dxa"/>
             <w:gridSpan w:val="7"/>
             <w:vAlign w:val="center"/>
           </w:tcPr>
@@ -4260,7 +5151,7 @@
         </w:tc>
         <w:tc>
           <w:tcPr>
-            <w:tcW w:w="4971" w:type="dxa"/>
+            <w:tcW w:w="5113" w:type="dxa"/>
             <w:gridSpan w:val="7"/>
             <w:vAlign w:val="center"/>
           </w:tcPr>
@@ -4339,6 +5230,7 @@
                 <w:sz w:val="20"/>
                 <w:szCs w:val="20"/>
               </w:rPr>
+              <w:lastRenderedPageBreak/>
               <w:t>9</w:t>
             </w:r>
           </w:p>
@@ -4371,7 +5263,7 @@
         </w:tc>
         <w:tc>
           <w:tcPr>
-            <w:tcW w:w="4971" w:type="dxa"/>
+            <w:tcW w:w="5113" w:type="dxa"/>
             <w:gridSpan w:val="7"/>
             <w:vAlign w:val="center"/>
           </w:tcPr>
@@ -4472,7 +5364,7 @@
         </w:tc>
         <w:tc>
           <w:tcPr>
-            <w:tcW w:w="4971" w:type="dxa"/>
+            <w:tcW w:w="5113" w:type="dxa"/>
             <w:gridSpan w:val="7"/>
             <w:vAlign w:val="center"/>
           </w:tcPr>
@@ -4552,22 +5444,47 @@
         </w:tc>
         <w:tc>
           <w:tcPr>
-            <w:tcW w:w="4971" w:type="dxa"/>
+            <w:tcW w:w="5113" w:type="dxa"/>
             <w:gridSpan w:val="7"/>
             <w:vAlign w:val="center"/>
           </w:tcPr>
           <w:p>
-            <w:r>
-              <w:t xml:space="preserve">Se acatan las instrucciones impartidas por el Ministerio a través del supervisor del contrato. Durante mayo se atendió la directriz del </w:t>
-            </w:r>
-            <w:proofErr w:type="gramStart"/>
-            <w:r>
-              <w:t>Viceministro</w:t>
-            </w:r>
-            <w:proofErr w:type="gramEnd"/>
-            <w:r>
-              <w:t xml:space="preserve"> de centralizar los avances de todos los grupos de la Dirección en el Portal de Dirección como plataforma oficial.</w:t>
-            </w:r>
+            <w:pPr>
+              <w:jc w:val="both"/>
+              <w:rPr>
+                <w:rFonts w:ascii="Arial" w:eastAsia="Arial" w:hAnsi="Arial" w:cs="Arial"/>
+                <w:sz w:val="20"/>
+                <w:szCs w:val="20"/>
+              </w:rPr>
+            </w:pPr>
+          </w:p>
+          <w:p>
+            <w:pPr>
+              <w:jc w:val="both"/>
+              <w:rPr>
+                <w:rFonts w:ascii="Arial" w:eastAsia="Arial" w:hAnsi="Arial" w:cs="Arial"/>
+                <w:sz w:val="20"/>
+                <w:szCs w:val="20"/>
+              </w:rPr>
+            </w:pPr>
+            <w:r>
+              <w:rPr>
+                <w:rFonts w:ascii="Arial" w:eastAsia="Arial" w:hAnsi="Arial" w:cs="Arial"/>
+                <w:sz w:val="20"/>
+                <w:szCs w:val="20"/>
+              </w:rPr>
+              <w:t>Se acatan las instrucciones impartidas por el Ministerio, a través del supervisor del contrato, durante el desarrollo del mismo.</w:t>
+            </w:r>
+          </w:p>
+          <w:p>
+            <w:pPr>
+              <w:jc w:val="both"/>
+              <w:rPr>
+                <w:rFonts w:ascii="Arial" w:eastAsia="Arial" w:hAnsi="Arial" w:cs="Arial"/>
+                <w:sz w:val="20"/>
+                <w:szCs w:val="20"/>
+              </w:rPr>
+            </w:pPr>
           </w:p>
         </w:tc>
       </w:tr>
@@ -4627,7 +5544,7 @@
         </w:tc>
         <w:tc>
           <w:tcPr>
-            <w:tcW w:w="4971" w:type="dxa"/>
+            <w:tcW w:w="5113" w:type="dxa"/>
             <w:gridSpan w:val="7"/>
             <w:vAlign w:val="center"/>
           </w:tcPr>
@@ -4696,7 +5613,6 @@
                 <w:sz w:val="20"/>
                 <w:szCs w:val="20"/>
               </w:rPr>
-              <w:lastRenderedPageBreak/>
               <w:t>13</w:t>
             </w:r>
           </w:p>
@@ -4728,7 +5644,7 @@
         </w:tc>
         <w:tc>
           <w:tcPr>
-            <w:tcW w:w="4971" w:type="dxa"/>
+            <w:tcW w:w="5113" w:type="dxa"/>
             <w:gridSpan w:val="7"/>
             <w:vAlign w:val="center"/>
           </w:tcPr>
@@ -4828,7 +5744,7 @@
         </w:tc>
         <w:tc>
           <w:tcPr>
-            <w:tcW w:w="4971" w:type="dxa"/>
+            <w:tcW w:w="5113" w:type="dxa"/>
             <w:gridSpan w:val="7"/>
             <w:vAlign w:val="center"/>
           </w:tcPr>
@@ -4928,7 +5844,7 @@
         </w:tc>
         <w:tc>
           <w:tcPr>
-            <w:tcW w:w="4971" w:type="dxa"/>
+            <w:tcW w:w="5113" w:type="dxa"/>
             <w:gridSpan w:val="7"/>
             <w:vAlign w:val="center"/>
           </w:tcPr>
@@ -5018,7 +5934,7 @@
         </w:tc>
         <w:tc>
           <w:tcPr>
-            <w:tcW w:w="4971" w:type="dxa"/>
+            <w:tcW w:w="5113" w:type="dxa"/>
             <w:gridSpan w:val="7"/>
             <w:vAlign w:val="center"/>
           </w:tcPr>
@@ -5098,7 +6014,7 @@
         </w:tc>
         <w:tc>
           <w:tcPr>
-            <w:tcW w:w="4971" w:type="dxa"/>
+            <w:tcW w:w="5113" w:type="dxa"/>
             <w:gridSpan w:val="7"/>
             <w:vAlign w:val="center"/>
           </w:tcPr>
@@ -5178,13 +6094,26 @@
         </w:tc>
         <w:tc>
           <w:tcPr>
-            <w:tcW w:w="4971" w:type="dxa"/>
+            <w:tcW w:w="5113" w:type="dxa"/>
             <w:gridSpan w:val="7"/>
             <w:vAlign w:val="center"/>
           </w:tcPr>
           <w:p>
-            <w:r>
-              <w:t>Se prepara la carga mensual de informes en SECOP II, ítem 7-Ejecución del contrato. El presente informe y las evidencias del mes de mayo se encuentran en proceso de carga con los soportes de la carpeta evidencias mayo.</w:t>
+            <w:pPr>
+              <w:jc w:val="both"/>
+              <w:rPr>
+                <w:rFonts w:ascii="Arial" w:eastAsia="Arial" w:hAnsi="Arial" w:cs="Arial"/>
+                <w:sz w:val="20"/>
+                <w:szCs w:val="20"/>
+              </w:rPr>
+            </w:pPr>
+            <w:r>
+              <w:rPr>
+                <w:rFonts w:ascii="Arial" w:eastAsia="Arial" w:hAnsi="Arial" w:cs="Arial"/>
+                <w:sz w:val="20"/>
+                <w:szCs w:val="20"/>
+              </w:rPr>
+              <w:t>Se cargan mensualmente los informes que demuestran el cumplimiento de las obligaciones contractuales en la plataforma transaccional de Colombia Compra Eficiente SECOP II, de acuerdo con los requerimientos establecidos.</w:t>
             </w:r>
           </w:p>
         </w:tc>
@@ -5214,6 +6143,7 @@
                 <w:sz w:val="20"/>
                 <w:szCs w:val="20"/>
               </w:rPr>
+              <w:lastRenderedPageBreak/>
               <w:t>19</w:t>
             </w:r>
           </w:p>
@@ -5245,7 +6175,7 @@
         </w:tc>
         <w:tc>
           <w:tcPr>
-            <w:tcW w:w="4971" w:type="dxa"/>
+            <w:tcW w:w="5113" w:type="dxa"/>
             <w:gridSpan w:val="7"/>
             <w:vAlign w:val="center"/>
           </w:tcPr>
@@ -5335,7 +6265,7 @@
         </w:tc>
         <w:tc>
           <w:tcPr>
-            <w:tcW w:w="4971" w:type="dxa"/>
+            <w:tcW w:w="5113" w:type="dxa"/>
             <w:gridSpan w:val="7"/>
             <w:vAlign w:val="center"/>
           </w:tcPr>
@@ -5354,25 +6284,7 @@
                 <w:sz w:val="20"/>
                 <w:szCs w:val="20"/>
               </w:rPr>
-              <w:t xml:space="preserve">Se realizará la entrega de los bienes de propiedad del Ministerio de Minas y Energía asignados durante la ejecución del contrato a través del supervisor del contrato, siguiendo las directrices establecidas en el Manual para el manejo de los bienes de propiedad del Ministerio. Además, se gestiona </w:t>
-            </w:r>
-            <w:proofErr w:type="gramStart"/>
-            <w:r>
-              <w:rPr>
-                <w:rFonts w:ascii="Arial" w:eastAsia="Arial" w:hAnsi="Arial" w:cs="Arial"/>
-                <w:sz w:val="20"/>
-                <w:szCs w:val="20"/>
-              </w:rPr>
-              <w:t>el paz</w:t>
-            </w:r>
-            <w:proofErr w:type="gramEnd"/>
-            <w:r>
-              <w:rPr>
-                <w:rFonts w:ascii="Arial" w:eastAsia="Arial" w:hAnsi="Arial" w:cs="Arial"/>
-                <w:sz w:val="20"/>
-                <w:szCs w:val="20"/>
-              </w:rPr>
-              <w:t xml:space="preserve"> y salvo correspondiente con el Grupo de Servicios Administrativos.</w:t>
+              <w:t>Se realizará la entrega de los bienes de propiedad del Ministerio de Minas y Energía asignados durante la ejecución del contrato a través del supervisor del contrato, siguiendo las directrices establecidas en el Manual para el manejo de los bienes de propiedad del Ministerio. Además, se gestiona el paz y salvo correspondiente con el Grupo de Servicios Administrativos.</w:t>
             </w:r>
           </w:p>
         </w:tc>
@@ -5433,7 +6345,7 @@
         </w:tc>
         <w:tc>
           <w:tcPr>
-            <w:tcW w:w="4971" w:type="dxa"/>
+            <w:tcW w:w="5113" w:type="dxa"/>
             <w:gridSpan w:val="7"/>
             <w:vAlign w:val="center"/>
           </w:tcPr>
@@ -5507,22 +6419,13 @@
                 <w:sz w:val="20"/>
                 <w:szCs w:val="20"/>
               </w:rPr>
-              <w:t xml:space="preserve">Cumplir con los lineamientos en Seguridad y Salud en el trabajo para Contratistas, Subcontratistas y Proveedores de conformidad con el artículo 2.2.4.2.2.16 del Decreto 1072 de 2015, la Resolución No 0312 de 2019 del Ministerio del Trabajo, la Resolución 042 0331 de 2019 del Ministerio de Minas y Energía  y demás normas </w:t>
-            </w:r>
-            <w:r>
-              <w:rPr>
-                <w:rFonts w:ascii="Arial" w:eastAsia="Arial" w:hAnsi="Arial" w:cs="Arial"/>
-                <w:sz w:val="20"/>
-                <w:szCs w:val="20"/>
-              </w:rPr>
-              <w:lastRenderedPageBreak/>
-              <w:t>concordantes sobre la materia  para lo cual se deberá diligenciar el Anexo: Compromiso del contratista, subcontratista o proveedor en seguridad y salud en el trabajo del Manual de  contratistas y proveedores para el funcionamiento del SGSSTE.</w:t>
-            </w:r>
-          </w:p>
-        </w:tc>
-        <w:tc>
-          <w:tcPr>
-            <w:tcW w:w="4971" w:type="dxa"/>
+              <w:t>Cumplir con los lineamientos en Seguridad y Salud en el trabajo para Contratistas, Subcontratistas y Proveedores de conformidad con el artículo 2.2.4.2.2.16 del Decreto 1072 de 2015, la Resolución No 0312 de 2019 del Ministerio del Trabajo, la Resolución 042 0331 de 2019 del Ministerio de Minas y Energía  y demás normas concordantes sobre la materia  para lo cual se deberá diligenciar el Anexo: Compromiso del contratista, subcontratista o proveedor en seguridad y salud en el trabajo del Manual de  contratistas y proveedores para el funcionamiento del SGSSTE.</w:t>
+            </w:r>
+          </w:p>
+        </w:tc>
+        <w:tc>
+          <w:tcPr>
+            <w:tcW w:w="5113" w:type="dxa"/>
             <w:gridSpan w:val="7"/>
             <w:vAlign w:val="center"/>
           </w:tcPr>
@@ -5541,17 +6444,7 @@
                 <w:sz w:val="20"/>
                 <w:szCs w:val="20"/>
               </w:rPr>
-              <w:lastRenderedPageBreak/>
-              <w:t xml:space="preserve">Se cumple con los lineamientos en Seguridad y Salud en el trabajo para Contratistas, Subcontratistas y Proveedores, de acuerdo con el artículo 2.2.4.2.2.16 del Decreto 1072 de 2015, la Resolución No 0312 de 2019 del Ministerio del Trabajo, la Resolución 042 0331 de 2019 del Ministerio de Minas y Energía y </w:t>
-            </w:r>
-            <w:r>
-              <w:rPr>
-                <w:rFonts w:ascii="Arial" w:eastAsia="Arial" w:hAnsi="Arial" w:cs="Arial"/>
-                <w:sz w:val="20"/>
-                <w:szCs w:val="20"/>
-              </w:rPr>
-              <w:lastRenderedPageBreak/>
-              <w:t>demás normas relacionadas. Para ello, se diligenció el Anexo: Compromiso del contratista, subcontratista o proveedor en seguridad y salud en el trabajo del Manual de contratistas y proveedores para el funcionamiento del SGSSTE.</w:t>
+              <w:t>Se cumple con los lineamientos en Seguridad y Salud en el trabajo para Contratistas, Subcontratistas y Proveedores, de acuerdo con el artículo 2.2.4.2.2.16 del Decreto 1072 de 2015, la Resolución No 0312 de 2019 del Ministerio del Trabajo, la Resolución 042 0331 de 2019 del Ministerio de Minas y Energía y demás normas relacionadas. Para ello, se diligenció el Anexo: Compromiso del contratista, subcontratista o proveedor en seguridad y salud en el trabajo del Manual de contratistas y proveedores para el funcionamiento del SGSSTE.</w:t>
             </w:r>
           </w:p>
         </w:tc>
@@ -5581,7 +6474,6 @@
                 <w:sz w:val="20"/>
                 <w:szCs w:val="20"/>
               </w:rPr>
-              <w:lastRenderedPageBreak/>
               <w:t>23</w:t>
             </w:r>
           </w:p>
@@ -5613,7 +6505,7 @@
         </w:tc>
         <w:tc>
           <w:tcPr>
-            <w:tcW w:w="4971" w:type="dxa"/>
+            <w:tcW w:w="5113" w:type="dxa"/>
             <w:gridSpan w:val="7"/>
             <w:vAlign w:val="center"/>
           </w:tcPr>
@@ -5693,7 +6585,7 @@
         </w:tc>
         <w:tc>
           <w:tcPr>
-            <w:tcW w:w="4971" w:type="dxa"/>
+            <w:tcW w:w="5113" w:type="dxa"/>
             <w:gridSpan w:val="7"/>
             <w:vAlign w:val="center"/>
           </w:tcPr>
@@ -5773,7 +6665,7 @@
         </w:tc>
         <w:tc>
           <w:tcPr>
-            <w:tcW w:w="4971" w:type="dxa"/>
+            <w:tcW w:w="5113" w:type="dxa"/>
             <w:gridSpan w:val="7"/>
             <w:vAlign w:val="center"/>
           </w:tcPr>
@@ -5863,14 +6755,37 @@
         </w:tc>
         <w:tc>
           <w:tcPr>
-            <w:tcW w:w="4971" w:type="dxa"/>
+            <w:tcW w:w="5113" w:type="dxa"/>
             <w:gridSpan w:val="7"/>
             <w:vAlign w:val="center"/>
           </w:tcPr>
           <w:p>
-            <w:r>
-              <w:t>Se atienden todas las demás disposiciones necesarias para el cabal cumplimiento del objeto contractual. Durante mayo se atendieron los requerimientos adicionales del portal DEE; los pendientes de pestaña X e hidrocarburos fueron comunicados oportunamente a la supervisión.</w:t>
-            </w:r>
+            <w:pPr>
+              <w:jc w:val="both"/>
+              <w:rPr>
+                <w:rFonts w:ascii="Arial" w:eastAsia="Arial" w:hAnsi="Arial" w:cs="Arial"/>
+                <w:sz w:val="20"/>
+                <w:szCs w:val="20"/>
+              </w:rPr>
+            </w:pPr>
+            <w:r>
+              <w:rPr>
+                <w:rFonts w:ascii="Arial" w:eastAsia="Arial" w:hAnsi="Arial" w:cs="Arial"/>
+                <w:sz w:val="20"/>
+                <w:szCs w:val="20"/>
+              </w:rPr>
+              <w:t>Se atienden todas las demás políticas, normativas y disposiciones necesarias para garantizar el cumplimiento total y efectivo del objeto contractual, asegurando así la integridad y la calidad en la ejecución de todas las actividades correspondientes.</w:t>
+            </w:r>
+          </w:p>
+          <w:p>
+            <w:pPr>
+              <w:jc w:val="both"/>
+              <w:rPr>
+                <w:rFonts w:ascii="Arial" w:eastAsia="Arial" w:hAnsi="Arial" w:cs="Arial"/>
+                <w:sz w:val="20"/>
+                <w:szCs w:val="20"/>
+              </w:rPr>
+            </w:pPr>
           </w:p>
         </w:tc>
       </w:tr>
@@ -5880,7 +6795,7 @@
         </w:trPr>
         <w:tc>
           <w:tcPr>
-            <w:tcW w:w="10774" w:type="dxa"/>
+            <w:tcW w:w="10916" w:type="dxa"/>
             <w:gridSpan w:val="18"/>
             <w:shd w:val="clear" w:color="auto" w:fill="ACB9CA"/>
             <w:vAlign w:val="center"/>
@@ -5904,6 +6819,7 @@
                 <w:sz w:val="20"/>
                 <w:szCs w:val="20"/>
               </w:rPr>
+              <w:lastRenderedPageBreak/>
               <w:t>DECLARACIÓN DE CUMPLIMIENTO</w:t>
             </w:r>
           </w:p>
@@ -5940,7 +6856,7 @@
         </w:tc>
         <w:tc>
           <w:tcPr>
-            <w:tcW w:w="10207" w:type="dxa"/>
+            <w:tcW w:w="10349" w:type="dxa"/>
             <w:gridSpan w:val="17"/>
             <w:shd w:val="clear" w:color="auto" w:fill="DBDBDB"/>
             <w:vAlign w:val="center"/>
@@ -5995,7 +6911,7 @@
         </w:tc>
         <w:tc>
           <w:tcPr>
-            <w:tcW w:w="10207" w:type="dxa"/>
+            <w:tcW w:w="10349" w:type="dxa"/>
             <w:gridSpan w:val="17"/>
             <w:shd w:val="clear" w:color="auto" w:fill="DBDBDB"/>
             <w:vAlign w:val="center"/>
@@ -6025,7 +6941,7 @@
         </w:trPr>
         <w:tc>
           <w:tcPr>
-            <w:tcW w:w="10774" w:type="dxa"/>
+            <w:tcW w:w="10916" w:type="dxa"/>
             <w:gridSpan w:val="18"/>
             <w:shd w:val="clear" w:color="auto" w:fill="ACB9CA"/>
             <w:vAlign w:val="center"/>
@@ -6087,30 +7003,65 @@
           <w:tcPr>
             <w:tcW w:w="4766" w:type="dxa"/>
             <w:gridSpan w:val="9"/>
-            <w:vAlign w:val="center"/>
-          </w:tcPr>
-          <w:p>
-            <w:r>
+          </w:tcPr>
+          <w:p>
+            <w:pPr>
+              <w:jc w:val="both"/>
+              <w:rPr>
+                <w:rFonts w:ascii="Arial" w:eastAsia="Arial" w:hAnsi="Arial" w:cs="Arial"/>
+                <w:sz w:val="20"/>
+                <w:szCs w:val="20"/>
+              </w:rPr>
+            </w:pPr>
+            <w:r>
+              <w:rPr>
+                <w:rFonts w:ascii="Arial" w:eastAsia="Arial" w:hAnsi="Arial" w:cs="Arial"/>
+                <w:sz w:val="20"/>
+                <w:szCs w:val="20"/>
+              </w:rPr>
               <w:t xml:space="preserve">Portal de Dirección de Energía Eléctrica (Next.js 16 + React 19 + TypeScript + Tailwind 4). </w:t>
             </w:r>
           </w:p>
         </w:tc>
         <w:tc>
           <w:tcPr>
-            <w:tcW w:w="5441" w:type="dxa"/>
+            <w:tcW w:w="5583" w:type="dxa"/>
             <w:gridSpan w:val="8"/>
-            <w:vAlign w:val="center"/>
-          </w:tcPr>
-          <w:p>
+          </w:tcPr>
+          <w:p>
+            <w:pPr>
+              <w:jc w:val="both"/>
+              <w:rPr>
+                <w:rFonts w:ascii="Arial" w:eastAsia="Arial" w:hAnsi="Arial" w:cs="Arial"/>
+                <w:sz w:val="20"/>
+                <w:szCs w:val="20"/>
+              </w:rPr>
+            </w:pPr>
             <w:hyperlink r:id="rId8" w:history="1">
               <w:r>
                 <w:rPr>
                   <w:rStyle w:val="Hipervnculo"/>
+                  <w:rFonts w:ascii="Arial" w:eastAsia="Arial" w:hAnsi="Arial" w:cs="Arial"/>
+                  <w:sz w:val="20"/>
+                  <w:szCs w:val="20"/>
                 </w:rPr>
                 <w:t>https://portalviceministerioenergia.minenergia.gov.co/</w:t>
               </w:r>
             </w:hyperlink>
             <w:r>
+              <w:rPr>
+                <w:rFonts w:ascii="Arial" w:eastAsia="Arial" w:hAnsi="Arial" w:cs="Arial"/>
+                <w:sz w:val="20"/>
+                <w:szCs w:val="20"/>
+              </w:rPr>
+              <w:t xml:space="preserve"> </w:t>
+            </w:r>
+            <w:r>
+              <w:rPr>
+                <w:rFonts w:ascii="Arial" w:eastAsia="Arial" w:hAnsi="Arial" w:cs="Arial"/>
+                <w:sz w:val="20"/>
+                <w:szCs w:val="20"/>
+              </w:rPr>
               <w:t xml:space="preserve"> </w:t>
             </w:r>
           </w:p>
@@ -6172,7 +7123,7 @@
         </w:tc>
         <w:tc>
           <w:tcPr>
-            <w:tcW w:w="5441" w:type="dxa"/>
+            <w:tcW w:w="5583" w:type="dxa"/>
             <w:gridSpan w:val="8"/>
             <w:vAlign w:val="center"/>
           </w:tcPr>
@@ -6235,7 +7186,6 @@
                 <w:sz w:val="20"/>
                 <w:szCs w:val="20"/>
               </w:rPr>
-              <w:lastRenderedPageBreak/>
               <w:t>3</w:t>
             </w:r>
           </w:p>
@@ -6247,14 +7197,35 @@
             <w:vAlign w:val="center"/>
           </w:tcPr>
           <w:p>
-            <w:r>
-              <w:t>Chatbot Telegram multi-menú con información DEE</w:t>
-            </w:r>
-          </w:p>
-        </w:tc>
-        <w:tc>
-          <w:tcPr>
-            <w:tcW w:w="5441" w:type="dxa"/>
+            <w:pPr>
+              <w:jc w:val="both"/>
+              <w:rPr>
+                <w:rFonts w:ascii="Arial" w:eastAsia="Arial" w:hAnsi="Arial" w:cs="Arial"/>
+                <w:sz w:val="20"/>
+                <w:szCs w:val="20"/>
+              </w:rPr>
+            </w:pPr>
+            <w:r>
+              <w:rPr>
+                <w:rFonts w:ascii="Arial" w:eastAsia="Arial" w:hAnsi="Arial" w:cs="Arial"/>
+                <w:sz w:val="20"/>
+                <w:szCs w:val="20"/>
+              </w:rPr>
+              <w:t>Chat bot de Telegram</w:t>
+            </w:r>
+            <w:r>
+              <w:rPr>
+                <w:rFonts w:ascii="Arial" w:eastAsia="Arial" w:hAnsi="Arial" w:cs="Arial"/>
+                <w:sz w:val="20"/>
+                <w:szCs w:val="20"/>
+              </w:rPr>
+              <w:t>.</w:t>
+            </w:r>
+          </w:p>
+        </w:tc>
+        <w:tc>
+          <w:tcPr>
+            <w:tcW w:w="5583" w:type="dxa"/>
             <w:gridSpan w:val="8"/>
             <w:vAlign w:val="center"/>
           </w:tcPr>
@@ -6399,25 +7370,7 @@
                 <w:sz w:val="20"/>
                 <w:szCs w:val="20"/>
               </w:rPr>
-              <w:t xml:space="preserve">Repositorios </w:t>
-            </w:r>
-            <w:proofErr w:type="gramStart"/>
-            <w:r>
-              <w:rPr>
-                <w:rFonts w:ascii="Arial" w:eastAsia="Arial" w:hAnsi="Arial" w:cs="Arial"/>
-                <w:sz w:val="20"/>
-                <w:szCs w:val="20"/>
-              </w:rPr>
-              <w:t>GitHub  Portal</w:t>
-            </w:r>
-            <w:proofErr w:type="gramEnd"/>
-            <w:r>
-              <w:rPr>
-                <w:rFonts w:ascii="Arial" w:eastAsia="Arial" w:hAnsi="Arial" w:cs="Arial"/>
-                <w:sz w:val="20"/>
-                <w:szCs w:val="20"/>
-              </w:rPr>
-              <w:t>-MME-Backend</w:t>
+              <w:t>Repositorios GitHub  Portal-MME-Backend</w:t>
             </w:r>
             <w:r>
               <w:rPr>
@@ -6431,7 +7384,7 @@
         </w:tc>
         <w:tc>
           <w:tcPr>
-            <w:tcW w:w="5441" w:type="dxa"/>
+            <w:tcW w:w="5583" w:type="dxa"/>
             <w:gridSpan w:val="8"/>
             <w:vAlign w:val="center"/>
           </w:tcPr>
@@ -6513,7 +7466,7 @@
         </w:trPr>
         <w:tc>
           <w:tcPr>
-            <w:tcW w:w="10774" w:type="dxa"/>
+            <w:tcW w:w="10916" w:type="dxa"/>
             <w:gridSpan w:val="18"/>
             <w:shd w:val="clear" w:color="auto" w:fill="D9D9D9" w:themeFill="background1" w:themeFillShade="D9"/>
             <w:vAlign w:val="center"/>
@@ -6661,7 +7614,7 @@
         </w:trPr>
         <w:tc>
           <w:tcPr>
-            <w:tcW w:w="10774" w:type="dxa"/>
+            <w:tcW w:w="10916" w:type="dxa"/>
             <w:gridSpan w:val="18"/>
             <w:shd w:val="clear" w:color="auto" w:fill="ACB9CA"/>
             <w:vAlign w:val="center"/>
@@ -6696,7 +7649,7 @@
         </w:trPr>
         <w:tc>
           <w:tcPr>
-            <w:tcW w:w="10774" w:type="dxa"/>
+            <w:tcW w:w="10916" w:type="dxa"/>
             <w:gridSpan w:val="18"/>
             <w:vAlign w:val="center"/>
           </w:tcPr>
@@ -6882,7 +7835,7 @@
         </w:trPr>
         <w:tc>
           <w:tcPr>
-            <w:tcW w:w="10774" w:type="dxa"/>
+            <w:tcW w:w="10916" w:type="dxa"/>
             <w:gridSpan w:val="18"/>
             <w:shd w:val="clear" w:color="auto" w:fill="ACB9CA"/>
             <w:vAlign w:val="center"/>
@@ -6906,6 +7859,7 @@
                 <w:sz w:val="20"/>
                 <w:szCs w:val="20"/>
               </w:rPr>
+              <w:lastRenderedPageBreak/>
               <w:t>CONTRATISTA</w:t>
             </w:r>
           </w:p>
@@ -6943,7 +7897,7 @@
         </w:tc>
         <w:tc>
           <w:tcPr>
-            <w:tcW w:w="8886" w:type="dxa"/>
+            <w:tcW w:w="9028" w:type="dxa"/>
             <w:gridSpan w:val="13"/>
             <w:vAlign w:val="center"/>
           </w:tcPr>
@@ -6967,7 +7921,7 @@
                 <w:szCs w:val="20"/>
               </w:rPr>
               <w:drawing>
-                <wp:inline distT="0" distB="0" distL="0" distR="0" wp14:anchorId="5E54A9BF" wp14:editId="7100EABC">
+                <wp:inline distT="0" distB="0" distL="0" distR="0" wp14:anchorId="6E0CA67B" wp14:editId="6E0CA67C">
                   <wp:extent cx="1688640" cy="1662718"/>
                   <wp:effectExtent l="104845" t="103008" r="104845" b="103008"/>
                   <wp:docPr id="3" name="image1.png"/>
@@ -7007,14 +7961,55 @@
       </w:tr>
     </w:tbl>
     <w:p/>
-    <w:p/>
+    <w:p>
+      <w:r>
+        <w:rPr>
+          <w:noProof/>
+        </w:rPr>
+        <w:drawing>
+          <wp:inline distT="0" distB="0" distL="0" distR="0" wp14:anchorId="45C5C373" wp14:editId="37586084">
+            <wp:extent cx="6438900" cy="2876430"/>
+            <wp:effectExtent l="0" t="0" r="0" b="635"/>
+            <wp:docPr id="906160457" name="Imagen 1"/>
+            <wp:cNvGraphicFramePr>
+              <a:graphicFrameLocks xmlns:a="http://schemas.openxmlformats.org/drawingml/2006/main" noChangeAspect="1"/>
+            </wp:cNvGraphicFramePr>
+            <a:graphic xmlns:a="http://schemas.openxmlformats.org/drawingml/2006/main">
+              <a:graphicData uri="http://schemas.openxmlformats.org/drawingml/2006/picture">
+                <pic:pic xmlns:pic="http://schemas.openxmlformats.org/drawingml/2006/picture">
+                  <pic:nvPicPr>
+                    <pic:cNvPr id="906160457" name=""/>
+                    <pic:cNvPicPr/>
+                  </pic:nvPicPr>
+                  <pic:blipFill>
+                    <a:blip r:embed="rId16"/>
+                    <a:stretch>
+                      <a:fillRect/>
+                    </a:stretch>
+                  </pic:blipFill>
+                  <pic:spPr>
+                    <a:xfrm>
+                      <a:off x="0" y="0"/>
+                      <a:ext cx="6456088" cy="2884108"/>
+                    </a:xfrm>
+                    <a:prstGeom prst="rect">
+                      <a:avLst/>
+                    </a:prstGeom>
+                  </pic:spPr>
+                </pic:pic>
+              </a:graphicData>
+            </a:graphic>
+          </wp:inline>
+        </w:drawing>
+      </w:r>
+    </w:p>
     <w:sectPr>
-      <w:headerReference w:type="even" r:id="rId16"/>
-      <w:headerReference w:type="default" r:id="rId17"/>
-      <w:footerReference w:type="even" r:id="rId18"/>
-      <w:footerReference w:type="default" r:id="rId19"/>
-      <w:headerReference w:type="first" r:id="rId20"/>
-      <w:footerReference w:type="first" r:id="rId21"/>
+      <w:headerReference w:type="even" r:id="rId17"/>
+      <w:headerReference w:type="default" r:id="rId18"/>
+      <w:footerReference w:type="even" r:id="rId19"/>
+      <w:footerReference w:type="default" r:id="rId20"/>
+      <w:headerReference w:type="first" r:id="rId21"/>
+      <w:footerReference w:type="first" r:id="rId22"/>
       <w:pgSz w:w="12240" w:h="15840"/>
       <w:pgMar w:top="1417" w:right="900" w:bottom="1417" w:left="1701" w:header="0" w:footer="708" w:gutter="0"/>
       <w:pgNumType w:start="1"/>
@@ -7338,7 +8333,7 @@
               <w:noProof/>
             </w:rPr>
             <w:drawing>
-              <wp:inline distT="0" distB="0" distL="0" distR="0" wp14:anchorId="7AF0A008" wp14:editId="7C384FE2">
+              <wp:inline distT="0" distB="0" distL="0" distR="0" wp14:anchorId="6E0CA695" wp14:editId="6E0CA696">
                 <wp:extent cx="751840" cy="741161"/>
                 <wp:effectExtent l="0" t="0" r="0" b="0"/>
                 <wp:docPr id="4" name="image3.png"/>
@@ -7421,7 +8416,7 @@
               <w:noProof/>
             </w:rPr>
             <w:drawing>
-              <wp:anchor distT="0" distB="0" distL="114300" distR="114300" simplePos="0" relativeHeight="251658240" behindDoc="0" locked="0" layoutInCell="1" hidden="0" allowOverlap="1" wp14:anchorId="175D9068" wp14:editId="7B79B0A2">
+              <wp:anchor distT="0" distB="0" distL="114300" distR="114300" simplePos="0" relativeHeight="251658240" behindDoc="0" locked="0" layoutInCell="1" hidden="0" allowOverlap="1" wp14:anchorId="6E0CA697" wp14:editId="6E0CA698">
                 <wp:simplePos x="0" y="0"/>
                 <wp:positionH relativeFrom="column">
                   <wp:posOffset>-76197</wp:posOffset>

</xml_diff>